<commit_message>
Update project report with natural humanized language and authentic student tone
</commit_message>
<xml_diff>
--- a/Udaan_Project_Viva_Documentation.docx
+++ b/Udaan_Project_Viva_Documentation.docx
@@ -13,8 +13,8 @@
           <w:b/>
           <w:bCs/>
           <w:color w:val="234B38"/>
-          <w:sz w:val="32"/>
-          <w:szCs w:val="32"/>
+          <w:sz w:val="30"/>
+          <w:szCs w:val="30"/>
         </w:rPr>
         <w:t xml:space="preserve">ONLINE CAREER GUIDANCE PORTAL FOR UNDERPRIVILEGED STUDENTS</w:t>
       </w:r>
@@ -28,15 +28,15 @@
         <w:rPr>
           <w:rFonts w:ascii="Calibri" w:cs="Calibri" w:eastAsia="Calibri" w:hAnsi="Calibri"/>
           <w:color w:val="C66B4E"/>
-          <w:sz w:val="24"/>
-          <w:szCs w:val="24"/>
+          <w:sz w:val="22"/>
+          <w:szCs w:val="22"/>
         </w:rPr>
         <w:t xml:space="preserve">Community Engagement Program (CEP)</w:t>
       </w:r>
     </w:p>
     <w:p>
       <w:pPr>
-        <w:spacing w:after="100" w:before="200"/>
+        <w:spacing w:after="80" w:before="180"/>
       </w:pPr>
     </w:p>
     <w:p>
@@ -50,8 +50,8 @@
           <w:b w:val="false"/>
           <w:bCs w:val="false"/>
           <w:color w:val="303832"/>
-          <w:sz w:val="22"/>
-          <w:szCs w:val="22"/>
+          <w:sz w:val="20"/>
+          <w:szCs w:val="20"/>
         </w:rPr>
         <w:t xml:space="preserve">Submitted by:</w:t>
       </w:r>
@@ -92,7 +92,7 @@
     </w:p>
     <w:p>
       <w:pPr>
-        <w:spacing w:after="80" w:before="160"/>
+        <w:spacing w:after="80" w:before="140"/>
       </w:pPr>
     </w:p>
     <w:p>
@@ -106,8 +106,8 @@
           <w:b w:val="false"/>
           <w:bCs w:val="false"/>
           <w:color w:val="303832"/>
-          <w:sz w:val="22"/>
-          <w:szCs w:val="22"/>
+          <w:sz w:val="20"/>
+          <w:szCs w:val="20"/>
         </w:rPr>
         <w:t xml:space="preserve">Under the Guidance of:</w:t>
       </w:r>
@@ -148,7 +148,7 @@
     </w:p>
     <w:p>
       <w:pPr>
-        <w:spacing w:after="100" w:before="200"/>
+        <w:spacing w:after="80" w:before="160"/>
       </w:pPr>
     </w:p>
     <w:p>
@@ -284,7 +284,7 @@
     </w:p>
     <w:p>
       <w:pPr>
-        <w:spacing w:after="60" w:before="100"/>
+        <w:spacing w:after="60" w:before="80"/>
       </w:pPr>
     </w:p>
     <w:p>
@@ -396,7 +396,7 @@
     </w:p>
     <w:p>
       <w:pPr>
-        <w:spacing w:after="60" w:before="100"/>
+        <w:spacing w:after="60" w:before="80"/>
       </w:pPr>
     </w:p>
     <w:p>
@@ -473,12 +473,12 @@
           <w:sz w:val="22"/>
           <w:szCs w:val="22"/>
         </w:rPr>
-        <w:t xml:space="preserve">I hereby certify that Mr. ZEESHAAN SHAIKH, student of N. G. Acharya &amp; D. K. Marathe College of Arts, Science &amp; Commerce studying in Bachelor of Information Technology SEM-V, has successfully completed the project on CEP Title: “ONLINE CAREER GUIDANCE PORTAL FOR UNDERPRIVILEGED STUDENTS” in the area of INFORMATION TECHNOLOGY specialization for the academic year 2026-2027. To the best of my knowledge, the work of the student is original and the information included in the project is correct.</w:t>
-      </w:r>
-    </w:p>
-    <w:p>
-      <w:pPr>
-        <w:spacing w:after="100" w:before="400"/>
+        <w:t xml:space="preserve">I hereby, certify that Mr. ZEESHAAN SHAIKH, student of N. G. Acharya &amp; D. K. Marathe College Arts, Science &amp; Commerce studying in Bachelor of Information Technology SEM-V has completed the project on Cep Title: “ONLINE CAREER GUIDANCE PORTAL FOR UNDERPRIVILEGED STUDENTS” in the area of INFORMATION TECHNOLOGY specialization for academic year 2026-2027. To the best of my Knowledge the work of the student is original and the information included in the project is correct.</w:t>
+      </w:r>
+    </w:p>
+    <w:p>
+      <w:pPr>
+        <w:spacing w:after="80" w:before="360"/>
       </w:pPr>
     </w:p>
     <w:tbl>
@@ -661,7 +661,7 @@
                 <w:sz w:val="22"/>
                 <w:szCs w:val="22"/>
               </w:rPr>
-              <w:t xml:space="preserve">Head of Department</w:t>
+              <w:t xml:space="preserve">Head Of Department</w:t>
             </w:r>
           </w:p>
           <w:p>
@@ -695,7 +695,7 @@
           </w:tcPr>
           <w:p>
             <w:pPr>
-              <w:spacing w:before="200"/>
+              <w:spacing w:before="180"/>
             </w:pPr>
           </w:p>
           <w:p>
@@ -744,7 +744,7 @@
           </w:tcPr>
           <w:p>
             <w:pPr>
-              <w:spacing w:before="200"/>
+              <w:spacing w:before="180"/>
             </w:pPr>
           </w:p>
           <w:p>
@@ -776,7 +776,7 @@
           </w:tcPr>
           <w:p>
             <w:pPr>
-              <w:spacing w:before="200"/>
+              <w:spacing w:before="180"/>
             </w:pPr>
           </w:p>
           <w:p>
@@ -840,7 +840,7 @@
     </w:p>
     <w:p>
       <w:pPr>
-        <w:spacing w:after="100" w:before="160"/>
+        <w:spacing w:after="80" w:before="140"/>
       </w:pPr>
     </w:p>
     <w:p>
@@ -854,7 +854,7 @@
           <w:sz w:val="22"/>
           <w:szCs w:val="22"/>
         </w:rPr>
-        <w:t xml:space="preserve">I, Mr. ZEESHAAN SHAIKH, student of N. G. Acharya &amp; D. K. Marathe College Arts, Science &amp; Commerce studying in Bachelor of Information Technology SEM-V, hereby declare that I have completed the Field Project titled “ONLINE CAREER GUIDANCE PORTAL FOR UNDERPRIVILEGED STUDENTS” during the academic year 2026-2027.</w:t>
+        <w:t xml:space="preserve">I, Mr. ZEESHAAN SHAIKH Student of N. G. Acharya &amp; D. K. Marathe College Arts, Science &amp; Commerce studying in Bachelor of Information Technology SEM-V, hereby declare that I have completed the Field Project titled ONLINE CAREER GUIDANCE PORTAL FOR UNDERPRIVILEGED STUDENTS During the academic year 2026-2027.</w:t>
       </w:r>
     </w:p>
     <w:p>
@@ -882,12 +882,12 @@
           <w:sz w:val="22"/>
           <w:szCs w:val="22"/>
         </w:rPr>
-        <w:t xml:space="preserve">Due credit is extended on the work of Literature/Secondary Survey by endorsing it in the Bibliography as per the prescribed format.</w:t>
-      </w:r>
-    </w:p>
-    <w:p>
-      <w:pPr>
-        <w:spacing w:after="80" w:before="400"/>
+        <w:t xml:space="preserve">Due credit is extended on the work of Literature/Secondary Survey by endorsing it in the Bibliography as per prescribed format.</w:t>
+      </w:r>
+    </w:p>
+    <w:p>
+      <w:pPr>
+        <w:spacing w:after="80" w:before="360"/>
       </w:pPr>
     </w:p>
     <w:p>
@@ -943,7 +943,7 @@
           <w:sz w:val="22"/>
           <w:szCs w:val="22"/>
         </w:rPr>
-        <w:t xml:space="preserve">Date: 23rd October 2026</w:t>
+        <w:t xml:space="preserve">Date: 23/10/2026</w:t>
       </w:r>
     </w:p>
     <w:p>
@@ -999,7 +999,7 @@
     </w:p>
     <w:p>
       <w:pPr>
-        <w:spacing w:after="60" w:before="100"/>
+        <w:spacing w:after="50" w:before="80"/>
       </w:pPr>
     </w:p>
     <w:p>
@@ -1089,7 +1089,7 @@
           <w:sz w:val="22"/>
           <w:szCs w:val="22"/>
         </w:rPr>
-        <w:t xml:space="preserve"> zeeshaan.shaikh.it@gmail.com</w:t>
+        <w:t xml:space="preserve"> shaikhzeeshaan11w@gmail.com</w:t>
       </w:r>
     </w:p>
     <w:p>
@@ -1170,16 +1170,16 @@
           <w:sz w:val="22"/>
           <w:szCs w:val="22"/>
         </w:rPr>
-        <w:t xml:space="preserve">Title of Community Engagement Project:</w:t>
-      </w:r>
-      <w:r>
-        <w:rPr>
-          <w:rFonts w:ascii="Calibri" w:cs="Calibri" w:eastAsia="Calibri" w:hAnsi="Calibri"/>
-          <w:color w:val="303832"/>
-          <w:sz w:val="22"/>
-          <w:szCs w:val="22"/>
-        </w:rPr>
-        <w:t xml:space="preserve"> Online Career guidance portal for underprivileged students (Udaan Portal)</w:t>
+        <w:t xml:space="preserve">Title/Heading of Community Engagement Projects:</w:t>
+      </w:r>
+      <w:r>
+        <w:rPr>
+          <w:rFonts w:ascii="Calibri" w:cs="Calibri" w:eastAsia="Calibri" w:hAnsi="Calibri"/>
+          <w:color w:val="303832"/>
+          <w:sz w:val="22"/>
+          <w:szCs w:val="22"/>
+        </w:rPr>
+        <w:t xml:space="preserve"> Online Career guidance portal for underprivileged students</w:t>
       </w:r>
     </w:p>
     <w:p>
@@ -1209,7 +1209,7 @@
           <w:sz w:val="22"/>
           <w:szCs w:val="22"/>
         </w:rPr>
-        <w:t xml:space="preserve"> The Udaan Online Career Guidance Portal aims to bridge the digital and professional counselling divide for students studying in Classes 9-12, ITI, Polytechnic, and undergraduate courses from low-income households in Chembur, Govandi, Mankhurd, and broader Maharashtra. The project provides vernacular educational guidance (English, Hindi, Marathi), connects students with official government scholarships (MahaDBT and National Scholarship Portal), details low-cost government college fee pathways, provides an automated 6-step guided career quiz with affordable vocational alternatives, and enforces child safeguarding for mentor interactions.</w:t>
+        <w:t xml:space="preserve"> The Online Career Guidance Portal for Underprivileged Students (Udaan) aims to help students who study in municipal schools, government colleges, and low-income areas like Chembur, Govandi, and Mankhurd. Most of these students have nobody at home who can guide them about college options. They only know about expensive engineering or medical courses, which their families cannot afford. This project provides a simple, free website in English, Hindi, and Marathi. It explains real education options like 10th and 12th streams, ITI trades, polytechnic diplomas, and regular degree courses. It also helps students find real scholarships on MahaDBT and the National Scholarship Portal, shows how much government colleges actually cost, and gives them a 6-step quiz to find affordable career paths with safe mentorship.</w:t>
       </w:r>
     </w:p>
     <w:p>
@@ -1260,16 +1260,16 @@
           <w:sz w:val="22"/>
           <w:szCs w:val="22"/>
         </w:rPr>
-        <w:t xml:space="preserve">Internship / Project related to major area of study:</w:t>
-      </w:r>
-      <w:r>
-        <w:rPr>
-          <w:rFonts w:ascii="Calibri" w:cs="Calibri" w:eastAsia="Calibri" w:hAnsi="Calibri"/>
-          <w:color w:val="303832"/>
-          <w:sz w:val="22"/>
-          <w:szCs w:val="22"/>
-        </w:rPr>
-        <w:t xml:space="preserve"> Strongly Agree [✓]</w:t>
+        <w:t xml:space="preserve">My internship experience was related to my major area of study/ academic program:</w:t>
+      </w:r>
+      <w:r>
+        <w:rPr>
+          <w:rFonts w:ascii="Calibri" w:cs="Calibri" w:eastAsia="Calibri" w:hAnsi="Calibri"/>
+          <w:color w:val="303832"/>
+          <w:sz w:val="22"/>
+          <w:szCs w:val="22"/>
+        </w:rPr>
+        <w:t xml:space="preserve"> Strongly Agree</w:t>
       </w:r>
     </w:p>
     <w:tbl>
@@ -2228,7 +2228,7 @@
                 <w:sz w:val="22"/>
                 <w:szCs w:val="22"/>
               </w:rPr>
-              <w:t xml:space="preserve">Provided a chance to use leadership skills (influence others, develop ideas)</w:t>
+              <w:t xml:space="preserve">Provided a chance to use leadership skills (influence others, develop ideas with others, stimulate decision-making and action)</w:t>
             </w:r>
           </w:p>
         </w:tc>
@@ -2883,7 +2883,7 @@
                 <w:sz w:val="22"/>
                 <w:szCs w:val="22"/>
               </w:rPr>
-              <w:t xml:space="preserve">Helped me discover new aspects of myself that I didn’t know existed</w:t>
+              <w:t xml:space="preserve">Helped me discover new aspects of myself that I didn’t know existed before</w:t>
             </w:r>
           </w:p>
         </w:tc>
@@ -3014,7 +3014,7 @@
                 <w:sz w:val="22"/>
                 <w:szCs w:val="22"/>
               </w:rPr>
-              <w:t xml:space="preserve">Helped me develop new interests and technical abilities</w:t>
+              <w:t xml:space="preserve">Helped me develop new interests and abilities</w:t>
             </w:r>
           </w:p>
         </w:tc>
@@ -3276,7 +3276,7 @@
                 <w:sz w:val="22"/>
                 <w:szCs w:val="22"/>
               </w:rPr>
-              <w:t xml:space="preserve">Allowed me to acquire information/equipment not available at my Institute</w:t>
+              <w:t xml:space="preserve">Allowed me to acquire information and/ or use equipment not available at my Institute</w:t>
             </w:r>
           </w:p>
         </w:tc>
@@ -3546,16 +3546,16 @@
           <w:sz w:val="22"/>
           <w:szCs w:val="22"/>
         </w:rPr>
-        <w:t xml:space="preserve">The faculty mentor extended guidance and mentoring throughout:</w:t>
-      </w:r>
-      <w:r>
-        <w:rPr>
-          <w:rFonts w:ascii="Calibri" w:cs="Calibri" w:eastAsia="Calibri" w:hAnsi="Calibri"/>
-          <w:color w:val="303832"/>
-          <w:sz w:val="22"/>
-          <w:szCs w:val="22"/>
-        </w:rPr>
-        <w:t xml:space="preserve"> Strongly Agree [✓]</w:t>
+        <w:t xml:space="preserve">The faculty mentor extended guidance and mentoring through-out the CEP process:</w:t>
+      </w:r>
+      <w:r>
+        <w:rPr>
+          <w:rFonts w:ascii="Calibri" w:cs="Calibri" w:eastAsia="Calibri" w:hAnsi="Calibri"/>
+          <w:color w:val="303832"/>
+          <w:sz w:val="22"/>
+          <w:szCs w:val="22"/>
+        </w:rPr>
+        <w:t xml:space="preserve"> Strongly Agree</w:t>
       </w:r>
     </w:p>
     <w:p>
@@ -3576,16 +3576,16 @@
           <w:sz w:val="22"/>
           <w:szCs w:val="22"/>
         </w:rPr>
-        <w:t xml:space="preserve">Able to accomplish initial goals, tasks and new skills in CEP plan:</w:t>
-      </w:r>
-      <w:r>
-        <w:rPr>
-          <w:rFonts w:ascii="Calibri" w:cs="Calibri" w:eastAsia="Calibri" w:hAnsi="Calibri"/>
-          <w:color w:val="303832"/>
-          <w:sz w:val="22"/>
-          <w:szCs w:val="22"/>
-        </w:rPr>
-        <w:t xml:space="preserve"> Strongly Agree [✓]</w:t>
+        <w:t xml:space="preserve">Were you able to accomplish the initial goals, tasks and new skills that were set down in CEP plan?</w:t>
+      </w:r>
+      <w:r>
+        <w:rPr>
+          <w:rFonts w:ascii="Calibri" w:cs="Calibri" w:eastAsia="Calibri" w:hAnsi="Calibri"/>
+          <w:color w:val="303832"/>
+          <w:sz w:val="22"/>
+          <w:szCs w:val="22"/>
+        </w:rPr>
+        <w:t xml:space="preserve"> Strongly Agree</w:t>
       </w:r>
     </w:p>
     <w:p>
@@ -3606,16 +3606,16 @@
           <w:sz w:val="22"/>
           <w:szCs w:val="22"/>
         </w:rPr>
-        <w:t xml:space="preserve">Overall rating of this CEP:</w:t>
-      </w:r>
-      <w:r>
-        <w:rPr>
-          <w:rFonts w:ascii="Calibri" w:cs="Calibri" w:eastAsia="Calibri" w:hAnsi="Calibri"/>
-          <w:color w:val="303832"/>
-          <w:sz w:val="22"/>
-          <w:szCs w:val="22"/>
-        </w:rPr>
-        <w:t xml:space="preserve"> Excellent [✓]</w:t>
+        <w:t xml:space="preserve">Considering your overall experience, how would you rate this CEP? (Circle one):</w:t>
+      </w:r>
+      <w:r>
+        <w:rPr>
+          <w:rFonts w:ascii="Calibri" w:cs="Calibri" w:eastAsia="Calibri" w:hAnsi="Calibri"/>
+          <w:color w:val="303832"/>
+          <w:sz w:val="22"/>
+          <w:szCs w:val="22"/>
+        </w:rPr>
+        <w:t xml:space="preserve"> Excellent</w:t>
       </w:r>
     </w:p>
     <w:p>
@@ -3677,7 +3677,7 @@
                 <w:sz w:val="16"/>
                 <w:szCs w:val="16"/>
               </w:rPr>
-              <w:t xml:space="preserve">Sr. No.</w:t>
+              <w:t xml:space="preserve">Sr.no</w:t>
             </w:r>
           </w:p>
         </w:tc>
@@ -3699,7 +3699,7 @@
                 <w:sz w:val="16"/>
                 <w:szCs w:val="16"/>
               </w:rPr>
-              <w:t xml:space="preserve">Topic / Chapter Title</w:t>
+              <w:t xml:space="preserve">Topic</w:t>
             </w:r>
           </w:p>
         </w:tc>
@@ -3721,7 +3721,7 @@
                 <w:sz w:val="16"/>
                 <w:szCs w:val="16"/>
               </w:rPr>
-              <w:t xml:space="preserve">Page Range</w:t>
+              <w:t xml:space="preserve">Pg.no</w:t>
             </w:r>
           </w:p>
         </w:tc>
@@ -3743,7 +3743,7 @@
                 <w:sz w:val="16"/>
                 <w:szCs w:val="16"/>
               </w:rPr>
-              <w:t xml:space="preserve">Guide Sign</w:t>
+              <w:t xml:space="preserve">Sign</w:t>
             </w:r>
           </w:p>
         </w:tc>
@@ -3786,7 +3786,7 @@
                 <w:sz w:val="22"/>
                 <w:szCs w:val="22"/>
               </w:rPr>
-              <w:t xml:space="preserve">INTRODUCTION (Document Observation)</w:t>
+              <w:t xml:space="preserve">INTRODUCTION Document Observation</w:t>
             </w:r>
           </w:p>
         </w:tc>
@@ -3808,7 +3808,7 @@
                 <w:sz w:val="16"/>
                 <w:szCs w:val="16"/>
               </w:rPr>
-              <w:t xml:space="preserve">1 - 5</w:t>
+              <w:t xml:space="preserve">1-5</w:t>
             </w:r>
           </w:p>
         </w:tc>
@@ -3895,7 +3895,7 @@
                 <w:sz w:val="16"/>
                 <w:szCs w:val="16"/>
               </w:rPr>
-              <w:t xml:space="preserve">1 - 2</w:t>
+              <w:t xml:space="preserve">1-2</w:t>
             </w:r>
           </w:p>
         </w:tc>
@@ -3960,7 +3960,7 @@
                 <w:sz w:val="22"/>
                 <w:szCs w:val="22"/>
               </w:rPr>
-              <w:t xml:space="preserve">1.2 Proposed System (Udaan Portal)</w:t>
+              <w:t xml:space="preserve">1.2 Proposed System</w:t>
             </w:r>
           </w:p>
         </w:tc>
@@ -3982,7 +3982,7 @@
                 <w:sz w:val="16"/>
                 <w:szCs w:val="16"/>
               </w:rPr>
-              <w:t xml:space="preserve">2 - 3</w:t>
+              <w:t xml:space="preserve">2</w:t>
             </w:r>
           </w:p>
         </w:tc>
@@ -4047,7 +4047,7 @@
                 <w:sz w:val="22"/>
                 <w:szCs w:val="22"/>
               </w:rPr>
-              <w:t xml:space="preserve">1.3 Normal Photos &amp; Geotag Photos (Fieldwork &amp; Community Demos)</w:t>
+              <w:t xml:space="preserve">1.3 Normal Photos &amp; Geotag Photos</w:t>
             </w:r>
           </w:p>
         </w:tc>
@@ -4069,7 +4069,7 @@
                 <w:sz w:val="16"/>
                 <w:szCs w:val="16"/>
               </w:rPr>
-              <w:t xml:space="preserve">3 - 4</w:t>
+              <w:t xml:space="preserve">3-4</w:t>
             </w:r>
           </w:p>
         </w:tc>
@@ -4221,7 +4221,7 @@
                 <w:sz w:val="22"/>
                 <w:szCs w:val="22"/>
               </w:rPr>
-              <w:t xml:space="preserve">LITERATURE REVIEW (Project Planning &amp; Design Document)</w:t>
+              <w:t xml:space="preserve">LITERATURE REVIEW Project Planning &amp; Design Document</w:t>
             </w:r>
           </w:p>
         </w:tc>
@@ -4243,7 +4243,7 @@
                 <w:sz w:val="16"/>
                 <w:szCs w:val="16"/>
               </w:rPr>
-              <w:t xml:space="preserve">6 - 10</w:t>
+              <w:t xml:space="preserve">6-10</w:t>
             </w:r>
           </w:p>
         </w:tc>
@@ -4308,7 +4308,7 @@
                 <w:sz w:val="22"/>
                 <w:szCs w:val="22"/>
               </w:rPr>
-              <w:t xml:space="preserve">2.1 Survey of Technology (Hardware &amp; Software Requirements)</w:t>
+              <w:t xml:space="preserve">2.1 Survey of Technology</w:t>
             </w:r>
           </w:p>
         </w:tc>
@@ -4330,7 +4330,7 @@
                 <w:sz w:val="16"/>
                 <w:szCs w:val="16"/>
               </w:rPr>
-              <w:t xml:space="preserve">6 - 7</w:t>
+              <w:t xml:space="preserve">6-7</w:t>
             </w:r>
           </w:p>
         </w:tc>
@@ -4395,7 +4395,7 @@
                 <w:sz w:val="22"/>
                 <w:szCs w:val="22"/>
               </w:rPr>
-              <w:t xml:space="preserve">2.2 Interview Questions (Community &amp; Underprivileged Student Survey)</w:t>
+              <w:t xml:space="preserve">2.2 Interview Questions</w:t>
             </w:r>
           </w:p>
         </w:tc>
@@ -4417,7 +4417,7 @@
                 <w:sz w:val="16"/>
                 <w:szCs w:val="16"/>
               </w:rPr>
-              <w:t xml:space="preserve">7 - 8</w:t>
+              <w:t xml:space="preserve">7-8</w:t>
             </w:r>
           </w:p>
         </w:tc>
@@ -4482,7 +4482,7 @@
                 <w:sz w:val="22"/>
                 <w:szCs w:val="22"/>
               </w:rPr>
-              <w:t xml:space="preserve">2.3 Data Collection Plan (Requirement Gathering)</w:t>
+              <w:t xml:space="preserve">2.3 Data Collection Plan</w:t>
             </w:r>
           </w:p>
         </w:tc>
@@ -4504,7 +4504,7 @@
                 <w:sz w:val="16"/>
                 <w:szCs w:val="16"/>
               </w:rPr>
-              <w:t xml:space="preserve">8 - 9</w:t>
+              <w:t xml:space="preserve">8-9</w:t>
             </w:r>
           </w:p>
         </w:tc>
@@ -4569,7 +4569,7 @@
                 <w:sz w:val="22"/>
                 <w:szCs w:val="22"/>
               </w:rPr>
-              <w:t xml:space="preserve">2.4 Supporting Material (Application Architecture &amp; Modules)</w:t>
+              <w:t xml:space="preserve">2.4 Supporting Material</w:t>
             </w:r>
           </w:p>
         </w:tc>
@@ -4656,7 +4656,7 @@
                 <w:sz w:val="22"/>
                 <w:szCs w:val="22"/>
               </w:rPr>
-              <w:t xml:space="preserve">METHODOLOGY (Design Documentation)</w:t>
+              <w:t xml:space="preserve">METHODOLOGY Design Documentation</w:t>
             </w:r>
           </w:p>
         </w:tc>
@@ -4678,7 +4678,7 @@
                 <w:sz w:val="16"/>
                 <w:szCs w:val="16"/>
               </w:rPr>
-              <w:t xml:space="preserve">11 - 15</w:t>
+              <w:t xml:space="preserve">11-15</w:t>
             </w:r>
           </w:p>
         </w:tc>
@@ -4743,7 +4743,7 @@
                 <w:sz w:val="22"/>
                 <w:szCs w:val="22"/>
               </w:rPr>
-              <w:t xml:space="preserve">3.1 ER Diagram (Entity Relationship Architecture)</w:t>
+              <w:t xml:space="preserve">3.1 ER Diagram</w:t>
             </w:r>
           </w:p>
         </w:tc>
@@ -4830,7 +4830,7 @@
                 <w:sz w:val="22"/>
                 <w:szCs w:val="22"/>
               </w:rPr>
-              <w:t xml:space="preserve">3.2 Class Diagram (Component &amp; Service Object Model)</w:t>
+              <w:t xml:space="preserve">3.2 Class Diagram</w:t>
             </w:r>
           </w:p>
         </w:tc>
@@ -4917,7 +4917,7 @@
                 <w:sz w:val="22"/>
                 <w:szCs w:val="22"/>
               </w:rPr>
-              <w:t xml:space="preserve">3.3 Flowchart (Complete Student Navigation &amp; Logic)</w:t>
+              <w:t xml:space="preserve">3.3 Flowchart</w:t>
             </w:r>
           </w:p>
         </w:tc>
@@ -5004,7 +5004,7 @@
                 <w:sz w:val="22"/>
                 <w:szCs w:val="22"/>
               </w:rPr>
-              <w:t xml:space="preserve">3.4 Activity Diagram (Assessment &amp; Affordability Swimlanes)</w:t>
+              <w:t xml:space="preserve">3.4 Activity Diagram</w:t>
             </w:r>
           </w:p>
         </w:tc>
@@ -5091,7 +5091,7 @@
                 <w:sz w:val="22"/>
                 <w:szCs w:val="22"/>
               </w:rPr>
-              <w:t xml:space="preserve">3.5 Sequence Diagram (Interactive Message Exchanges)</w:t>
+              <w:t xml:space="preserve">3.5 Sequence Diagram</w:t>
             </w:r>
           </w:p>
         </w:tc>
@@ -5178,7 +5178,7 @@
                 <w:sz w:val="22"/>
                 <w:szCs w:val="22"/>
               </w:rPr>
-              <w:t xml:space="preserve">DESCRIPTION OF SYSTEM MODULES &amp; DATA DESIGN</w:t>
+              <w:t xml:space="preserve">Description of Communication Training Module Outline</w:t>
             </w:r>
           </w:p>
         </w:tc>
@@ -5200,7 +5200,7 @@
                 <w:sz w:val="16"/>
                 <w:szCs w:val="16"/>
               </w:rPr>
-              <w:t xml:space="preserve">16 - 21</w:t>
+              <w:t xml:space="preserve">16-21</w:t>
             </w:r>
           </w:p>
         </w:tc>
@@ -5265,7 +5265,7 @@
                 <w:sz w:val="22"/>
                 <w:szCs w:val="22"/>
               </w:rPr>
-              <w:t xml:space="preserve">4.1 Introduction to Core Modules</w:t>
+              <w:t xml:space="preserve">4.1 Basic to Modules:</w:t>
             </w:r>
           </w:p>
         </w:tc>
@@ -5352,7 +5352,7 @@
                 <w:sz w:val="22"/>
                 <w:szCs w:val="22"/>
               </w:rPr>
-              <w:t xml:space="preserve">    4.1.1 Career Explorer &amp; Reality Check Module</w:t>
+              <w:t xml:space="preserve">    4.1.1 Career Explorer Module:</w:t>
             </w:r>
           </w:p>
         </w:tc>
@@ -5439,7 +5439,7 @@
                 <w:sz w:val="22"/>
                 <w:szCs w:val="22"/>
               </w:rPr>
-              <w:t xml:space="preserve">    4.1.2 Scholarship &amp; Financial Assistance Module (MahaDBT &amp; NSP)</w:t>
+              <w:t xml:space="preserve">    4.1.2 Scholarship &amp; Financial Aid Module:</w:t>
             </w:r>
           </w:p>
         </w:tc>
@@ -5526,7 +5526,7 @@
                 <w:sz w:val="22"/>
                 <w:szCs w:val="22"/>
               </w:rPr>
-              <w:t xml:space="preserve">    4.1.3 Entrance Examination &amp; Admission Guide Module</w:t>
+              <w:t xml:space="preserve">    4.1.4 Reporting Information / Mentorship Module:</w:t>
             </w:r>
           </w:p>
         </w:tc>
@@ -5613,7 +5613,7 @@
                 <w:sz w:val="22"/>
                 <w:szCs w:val="22"/>
               </w:rPr>
-              <w:t xml:space="preserve">    4.1.4 Guided Career Assessment &amp; Low-Cost Pathway Generator</w:t>
+              <w:t xml:space="preserve">4.2 Data Design:</w:t>
             </w:r>
           </w:p>
         </w:tc>
@@ -5700,7 +5700,7 @@
                 <w:sz w:val="22"/>
                 <w:szCs w:val="22"/>
               </w:rPr>
-              <w:t xml:space="preserve">    4.1.5 Human Mentorship &amp; Minor Safeguarding Verification</w:t>
+              <w:t xml:space="preserve">    4.2.1 Career Data:</w:t>
             </w:r>
           </w:p>
         </w:tc>
@@ -5787,7 +5787,7 @@
                 <w:sz w:val="22"/>
                 <w:szCs w:val="22"/>
               </w:rPr>
-              <w:t xml:space="preserve">    4.1.6 Interactive Student Action Roadmap &amp; Offline Tools</w:t>
+              <w:t xml:space="preserve">    4.2.2 Scholarship Data:</w:t>
             </w:r>
           </w:p>
         </w:tc>
@@ -5809,7 +5809,7 @@
                 <w:sz w:val="16"/>
                 <w:szCs w:val="16"/>
               </w:rPr>
-              <w:t xml:space="preserve">18</w:t>
+              <w:t xml:space="preserve">17</w:t>
             </w:r>
           </w:p>
         </w:tc>
@@ -5874,7 +5874,7 @@
                 <w:sz w:val="22"/>
                 <w:szCs w:val="22"/>
               </w:rPr>
-              <w:t xml:space="preserve">4.2 Data Design &amp; State Management</w:t>
+              <w:t xml:space="preserve">    4.2.3 Quiz Data:</w:t>
             </w:r>
           </w:p>
         </w:tc>
@@ -5896,7 +5896,7 @@
                 <w:sz w:val="16"/>
                 <w:szCs w:val="16"/>
               </w:rPr>
-              <w:t xml:space="preserve">18</w:t>
+              <w:t xml:space="preserve">17</w:t>
             </w:r>
           </w:p>
         </w:tc>
@@ -5961,7 +5961,7 @@
                 <w:sz w:val="22"/>
                 <w:szCs w:val="22"/>
               </w:rPr>
-              <w:t xml:space="preserve">    4.2.1 Career Data Schema</w:t>
+              <w:t xml:space="preserve">    4.2.4 Reporting Information Data:</w:t>
             </w:r>
           </w:p>
         </w:tc>
@@ -5983,7 +5983,7 @@
                 <w:sz w:val="16"/>
                 <w:szCs w:val="16"/>
               </w:rPr>
-              <w:t xml:space="preserve">18</w:t>
+              <w:t xml:space="preserve">17</w:t>
             </w:r>
           </w:p>
         </w:tc>
@@ -6048,7 +6048,7 @@
                 <w:sz w:val="22"/>
                 <w:szCs w:val="22"/>
               </w:rPr>
-              <w:t xml:space="preserve">    4.2.2 Scholarship &amp; MahaDBT Criteria Schema</w:t>
+              <w:t xml:space="preserve">    4.2.5 Database Usage:</w:t>
             </w:r>
           </w:p>
         </w:tc>
@@ -6135,7 +6135,7 @@
                 <w:sz w:val="22"/>
                 <w:szCs w:val="22"/>
               </w:rPr>
-              <w:t xml:space="preserve">    4.2.3 Examination &amp; Admission Timeline Schema</w:t>
+              <w:t xml:space="preserve">4.3 Graphical User Interface (GUI) Screenshots:</w:t>
             </w:r>
           </w:p>
         </w:tc>
@@ -6222,7 +6222,7 @@
                 <w:sz w:val="22"/>
                 <w:szCs w:val="22"/>
               </w:rPr>
-              <w:t xml:space="preserve">    4.2.4 Assessment &amp; Roadmap LocalStorage Cache Schema</w:t>
+              <w:t xml:space="preserve">    4.3.1 Home Page:</w:t>
             </w:r>
           </w:p>
         </w:tc>
@@ -6244,7 +6244,7 @@
                 <w:sz w:val="16"/>
                 <w:szCs w:val="16"/>
               </w:rPr>
-              <w:t xml:space="preserve">19</w:t>
+              <w:t xml:space="preserve">20</w:t>
             </w:r>
           </w:p>
         </w:tc>
@@ -6309,7 +6309,7 @@
                 <w:sz w:val="22"/>
                 <w:szCs w:val="22"/>
               </w:rPr>
-              <w:t xml:space="preserve">    4.2.5 Mentorship &amp; Minor Consent Verification Schema</w:t>
+              <w:t xml:space="preserve">    4.3.2 Career Explorer Page:</w:t>
             </w:r>
           </w:p>
         </w:tc>
@@ -6331,7 +6331,7 @@
                 <w:sz w:val="16"/>
                 <w:szCs w:val="16"/>
               </w:rPr>
-              <w:t xml:space="preserve">19</w:t>
+              <w:t xml:space="preserve">21</w:t>
             </w:r>
           </w:p>
         </w:tc>
@@ -6377,7 +6377,7 @@
                 <w:sz w:val="16"/>
                 <w:szCs w:val="16"/>
               </w:rPr>
-              <w:t xml:space="preserve"/>
+              <w:t xml:space="preserve">5</w:t>
             </w:r>
           </w:p>
         </w:tc>
@@ -6396,7 +6396,7 @@
                 <w:sz w:val="22"/>
                 <w:szCs w:val="22"/>
               </w:rPr>
-              <w:t xml:space="preserve">4.3 Graphical User Interface (GUI) Screenshots &amp; Verification</w:t>
+              <w:t xml:space="preserve">Conclusion &amp; Recommendation</w:t>
             </w:r>
           </w:p>
         </w:tc>
@@ -6418,7 +6418,7 @@
                 <w:sz w:val="16"/>
                 <w:szCs w:val="16"/>
               </w:rPr>
-              <w:t xml:space="preserve">20 - 21</w:t>
+              <w:t xml:space="preserve">22-23</w:t>
             </w:r>
           </w:p>
         </w:tc>
@@ -6464,7 +6464,7 @@
                 <w:sz w:val="16"/>
                 <w:szCs w:val="16"/>
               </w:rPr>
-              <w:t xml:space="preserve"/>
+              <w:t xml:space="preserve">6</w:t>
             </w:r>
           </w:p>
         </w:tc>
@@ -6483,790 +6483,7 @@
                 <w:sz w:val="22"/>
                 <w:szCs w:val="22"/>
               </w:rPr>
-              <w:t xml:space="preserve">    4.3.1 Home Page &amp; Hero Section</w:t>
-            </w:r>
-          </w:p>
-        </w:tc>
-        <w:tc>
-          <w:tcPr>
-            <w:tcW w:type="pct" w:w="750"/>
-          </w:tcPr>
-          <w:p>
-            <w:pPr>
-              <w:spacing w:after="60" w:before="60"/>
-              <w:jc w:val="center"/>
-            </w:pPr>
-            <w:r>
-              <w:rPr>
-                <w:rFonts w:ascii="Calibri" w:cs="Calibri" w:eastAsia="Calibri" w:hAnsi="Calibri"/>
-                <w:b w:val="false"/>
-                <w:bCs w:val="false"/>
-                <w:color w:val="303832"/>
-                <w:sz w:val="16"/>
-                <w:szCs w:val="16"/>
-              </w:rPr>
-              <w:t xml:space="preserve">20</w:t>
-            </w:r>
-          </w:p>
-        </w:tc>
-        <w:tc>
-          <w:tcPr>
-            <w:tcW w:type="pct" w:w="750"/>
-          </w:tcPr>
-          <w:p>
-            <w:pPr>
-              <w:spacing w:after="60" w:before="60"/>
-              <w:jc w:val="center"/>
-            </w:pPr>
-            <w:r>
-              <w:rPr>
-                <w:rFonts w:ascii="Calibri" w:cs="Calibri" w:eastAsia="Calibri" w:hAnsi="Calibri"/>
-                <w:b w:val="false"/>
-                <w:bCs w:val="false"/>
-                <w:color w:val="303832"/>
-                <w:sz w:val="16"/>
-                <w:szCs w:val="16"/>
-              </w:rPr>
-              <w:t xml:space="preserve"/>
-            </w:r>
-          </w:p>
-        </w:tc>
-      </w:tr>
-      <w:tr>
-        <w:tc>
-          <w:tcPr>
-            <w:tcW w:type="pct" w:w="750"/>
-          </w:tcPr>
-          <w:p>
-            <w:pPr>
-              <w:spacing w:after="60" w:before="60"/>
-              <w:jc w:val="center"/>
-            </w:pPr>
-            <w:r>
-              <w:rPr>
-                <w:rFonts w:ascii="Calibri" w:cs="Calibri" w:eastAsia="Calibri" w:hAnsi="Calibri"/>
-                <w:b/>
-                <w:bCs/>
-                <w:color w:val="303832"/>
-                <w:sz w:val="16"/>
-                <w:szCs w:val="16"/>
-              </w:rPr>
-              <w:t xml:space="preserve"/>
-            </w:r>
-          </w:p>
-        </w:tc>
-        <w:tc>
-          <w:tcPr>
-            <w:tcW w:type="pct" w:w="2750"/>
-          </w:tcPr>
-          <w:p>
-            <w:pPr>
-              <w:spacing w:after="60" w:before="60" w:line="300"/>
-            </w:pPr>
-            <w:r>
-              <w:rPr>
-                <w:rFonts w:ascii="Calibri" w:cs="Calibri" w:eastAsia="Calibri" w:hAnsi="Calibri"/>
-                <w:color w:val="303832"/>
-                <w:sz w:val="22"/>
-                <w:szCs w:val="22"/>
-              </w:rPr>
-              <w:t xml:space="preserve">    4.3.2 Career Explorer &amp; Domain Comparison Tool</w:t>
-            </w:r>
-          </w:p>
-        </w:tc>
-        <w:tc>
-          <w:tcPr>
-            <w:tcW w:type="pct" w:w="750"/>
-          </w:tcPr>
-          <w:p>
-            <w:pPr>
-              <w:spacing w:after="60" w:before="60"/>
-              <w:jc w:val="center"/>
-            </w:pPr>
-            <w:r>
-              <w:rPr>
-                <w:rFonts w:ascii="Calibri" w:cs="Calibri" w:eastAsia="Calibri" w:hAnsi="Calibri"/>
-                <w:b w:val="false"/>
-                <w:bCs w:val="false"/>
-                <w:color w:val="303832"/>
-                <w:sz w:val="16"/>
-                <w:szCs w:val="16"/>
-              </w:rPr>
-              <w:t xml:space="preserve">20</w:t>
-            </w:r>
-          </w:p>
-        </w:tc>
-        <w:tc>
-          <w:tcPr>
-            <w:tcW w:type="pct" w:w="750"/>
-          </w:tcPr>
-          <w:p>
-            <w:pPr>
-              <w:spacing w:after="60" w:before="60"/>
-              <w:jc w:val="center"/>
-            </w:pPr>
-            <w:r>
-              <w:rPr>
-                <w:rFonts w:ascii="Calibri" w:cs="Calibri" w:eastAsia="Calibri" w:hAnsi="Calibri"/>
-                <w:b w:val="false"/>
-                <w:bCs w:val="false"/>
-                <w:color w:val="303832"/>
-                <w:sz w:val="16"/>
-                <w:szCs w:val="16"/>
-              </w:rPr>
-              <w:t xml:space="preserve"/>
-            </w:r>
-          </w:p>
-        </w:tc>
-      </w:tr>
-      <w:tr>
-        <w:tc>
-          <w:tcPr>
-            <w:tcW w:type="pct" w:w="750"/>
-          </w:tcPr>
-          <w:p>
-            <w:pPr>
-              <w:spacing w:after="60" w:before="60"/>
-              <w:jc w:val="center"/>
-            </w:pPr>
-            <w:r>
-              <w:rPr>
-                <w:rFonts w:ascii="Calibri" w:cs="Calibri" w:eastAsia="Calibri" w:hAnsi="Calibri"/>
-                <w:b/>
-                <w:bCs/>
-                <w:color w:val="303832"/>
-                <w:sz w:val="16"/>
-                <w:szCs w:val="16"/>
-              </w:rPr>
-              <w:t xml:space="preserve"/>
-            </w:r>
-          </w:p>
-        </w:tc>
-        <w:tc>
-          <w:tcPr>
-            <w:tcW w:type="pct" w:w="2750"/>
-          </w:tcPr>
-          <w:p>
-            <w:pPr>
-              <w:spacing w:after="60" w:before="60" w:line="300"/>
-            </w:pPr>
-            <w:r>
-              <w:rPr>
-                <w:rFonts w:ascii="Calibri" w:cs="Calibri" w:eastAsia="Calibri" w:hAnsi="Calibri"/>
-                <w:color w:val="303832"/>
-                <w:sz w:val="22"/>
-                <w:szCs w:val="22"/>
-              </w:rPr>
-              <w:t xml:space="preserve">    4.3.3 Scholarship Finder &amp; MahaDBT Direct Portal Verification</w:t>
-            </w:r>
-          </w:p>
-        </w:tc>
-        <w:tc>
-          <w:tcPr>
-            <w:tcW w:type="pct" w:w="750"/>
-          </w:tcPr>
-          <w:p>
-            <w:pPr>
-              <w:spacing w:after="60" w:before="60"/>
-              <w:jc w:val="center"/>
-            </w:pPr>
-            <w:r>
-              <w:rPr>
-                <w:rFonts w:ascii="Calibri" w:cs="Calibri" w:eastAsia="Calibri" w:hAnsi="Calibri"/>
-                <w:b w:val="false"/>
-                <w:bCs w:val="false"/>
-                <w:color w:val="303832"/>
-                <w:sz w:val="16"/>
-                <w:szCs w:val="16"/>
-              </w:rPr>
-              <w:t xml:space="preserve">20</w:t>
-            </w:r>
-          </w:p>
-        </w:tc>
-        <w:tc>
-          <w:tcPr>
-            <w:tcW w:type="pct" w:w="750"/>
-          </w:tcPr>
-          <w:p>
-            <w:pPr>
-              <w:spacing w:after="60" w:before="60"/>
-              <w:jc w:val="center"/>
-            </w:pPr>
-            <w:r>
-              <w:rPr>
-                <w:rFonts w:ascii="Calibri" w:cs="Calibri" w:eastAsia="Calibri" w:hAnsi="Calibri"/>
-                <w:b w:val="false"/>
-                <w:bCs w:val="false"/>
-                <w:color w:val="303832"/>
-                <w:sz w:val="16"/>
-                <w:szCs w:val="16"/>
-              </w:rPr>
-              <w:t xml:space="preserve"/>
-            </w:r>
-          </w:p>
-        </w:tc>
-      </w:tr>
-      <w:tr>
-        <w:tc>
-          <w:tcPr>
-            <w:tcW w:type="pct" w:w="750"/>
-          </w:tcPr>
-          <w:p>
-            <w:pPr>
-              <w:spacing w:after="60" w:before="60"/>
-              <w:jc w:val="center"/>
-            </w:pPr>
-            <w:r>
-              <w:rPr>
-                <w:rFonts w:ascii="Calibri" w:cs="Calibri" w:eastAsia="Calibri" w:hAnsi="Calibri"/>
-                <w:b/>
-                <w:bCs/>
-                <w:color w:val="303832"/>
-                <w:sz w:val="16"/>
-                <w:szCs w:val="16"/>
-              </w:rPr>
-              <w:t xml:space="preserve"/>
-            </w:r>
-          </w:p>
-        </w:tc>
-        <w:tc>
-          <w:tcPr>
-            <w:tcW w:type="pct" w:w="2750"/>
-          </w:tcPr>
-          <w:p>
-            <w:pPr>
-              <w:spacing w:after="60" w:before="60" w:line="300"/>
-            </w:pPr>
-            <w:r>
-              <w:rPr>
-                <w:rFonts w:ascii="Calibri" w:cs="Calibri" w:eastAsia="Calibri" w:hAnsi="Calibri"/>
-                <w:color w:val="303832"/>
-                <w:sz w:val="22"/>
-                <w:szCs w:val="22"/>
-              </w:rPr>
-              <w:t xml:space="preserve">    4.3.4 Guided 6-Step Career Assessment Quiz</w:t>
-            </w:r>
-          </w:p>
-        </w:tc>
-        <w:tc>
-          <w:tcPr>
-            <w:tcW w:type="pct" w:w="750"/>
-          </w:tcPr>
-          <w:p>
-            <w:pPr>
-              <w:spacing w:after="60" w:before="60"/>
-              <w:jc w:val="center"/>
-            </w:pPr>
-            <w:r>
-              <w:rPr>
-                <w:rFonts w:ascii="Calibri" w:cs="Calibri" w:eastAsia="Calibri" w:hAnsi="Calibri"/>
-                <w:b w:val="false"/>
-                <w:bCs w:val="false"/>
-                <w:color w:val="303832"/>
-                <w:sz w:val="16"/>
-                <w:szCs w:val="16"/>
-              </w:rPr>
-              <w:t xml:space="preserve">21</w:t>
-            </w:r>
-          </w:p>
-        </w:tc>
-        <w:tc>
-          <w:tcPr>
-            <w:tcW w:type="pct" w:w="750"/>
-          </w:tcPr>
-          <w:p>
-            <w:pPr>
-              <w:spacing w:after="60" w:before="60"/>
-              <w:jc w:val="center"/>
-            </w:pPr>
-            <w:r>
-              <w:rPr>
-                <w:rFonts w:ascii="Calibri" w:cs="Calibri" w:eastAsia="Calibri" w:hAnsi="Calibri"/>
-                <w:b w:val="false"/>
-                <w:bCs w:val="false"/>
-                <w:color w:val="303832"/>
-                <w:sz w:val="16"/>
-                <w:szCs w:val="16"/>
-              </w:rPr>
-              <w:t xml:space="preserve"/>
-            </w:r>
-          </w:p>
-        </w:tc>
-      </w:tr>
-      <w:tr>
-        <w:tc>
-          <w:tcPr>
-            <w:tcW w:type="pct" w:w="750"/>
-          </w:tcPr>
-          <w:p>
-            <w:pPr>
-              <w:spacing w:after="60" w:before="60"/>
-              <w:jc w:val="center"/>
-            </w:pPr>
-            <w:r>
-              <w:rPr>
-                <w:rFonts w:ascii="Calibri" w:cs="Calibri" w:eastAsia="Calibri" w:hAnsi="Calibri"/>
-                <w:b/>
-                <w:bCs/>
-                <w:color w:val="303832"/>
-                <w:sz w:val="16"/>
-                <w:szCs w:val="16"/>
-              </w:rPr>
-              <w:t xml:space="preserve"/>
-            </w:r>
-          </w:p>
-        </w:tc>
-        <w:tc>
-          <w:tcPr>
-            <w:tcW w:type="pct" w:w="2750"/>
-          </w:tcPr>
-          <w:p>
-            <w:pPr>
-              <w:spacing w:after="60" w:before="60" w:line="300"/>
-            </w:pPr>
-            <w:r>
-              <w:rPr>
-                <w:rFonts w:ascii="Calibri" w:cs="Calibri" w:eastAsia="Calibri" w:hAnsi="Calibri"/>
-                <w:color w:val="303832"/>
-                <w:sz w:val="22"/>
-                <w:szCs w:val="22"/>
-              </w:rPr>
-              <w:t xml:space="preserve">    4.3.5 Verified Mentorship &amp; Minor Safeguarding Modal</w:t>
-            </w:r>
-          </w:p>
-        </w:tc>
-        <w:tc>
-          <w:tcPr>
-            <w:tcW w:type="pct" w:w="750"/>
-          </w:tcPr>
-          <w:p>
-            <w:pPr>
-              <w:spacing w:after="60" w:before="60"/>
-              <w:jc w:val="center"/>
-            </w:pPr>
-            <w:r>
-              <w:rPr>
-                <w:rFonts w:ascii="Calibri" w:cs="Calibri" w:eastAsia="Calibri" w:hAnsi="Calibri"/>
-                <w:b w:val="false"/>
-                <w:bCs w:val="false"/>
-                <w:color w:val="303832"/>
-                <w:sz w:val="16"/>
-                <w:szCs w:val="16"/>
-              </w:rPr>
-              <w:t xml:space="preserve">21</w:t>
-            </w:r>
-          </w:p>
-        </w:tc>
-        <w:tc>
-          <w:tcPr>
-            <w:tcW w:type="pct" w:w="750"/>
-          </w:tcPr>
-          <w:p>
-            <w:pPr>
-              <w:spacing w:after="60" w:before="60"/>
-              <w:jc w:val="center"/>
-            </w:pPr>
-            <w:r>
-              <w:rPr>
-                <w:rFonts w:ascii="Calibri" w:cs="Calibri" w:eastAsia="Calibri" w:hAnsi="Calibri"/>
-                <w:b w:val="false"/>
-                <w:bCs w:val="false"/>
-                <w:color w:val="303832"/>
-                <w:sz w:val="16"/>
-                <w:szCs w:val="16"/>
-              </w:rPr>
-              <w:t xml:space="preserve"/>
-            </w:r>
-          </w:p>
-        </w:tc>
-      </w:tr>
-      <w:tr>
-        <w:tc>
-          <w:tcPr>
-            <w:tcW w:type="pct" w:w="750"/>
-          </w:tcPr>
-          <w:p>
-            <w:pPr>
-              <w:spacing w:after="60" w:before="60"/>
-              <w:jc w:val="center"/>
-            </w:pPr>
-            <w:r>
-              <w:rPr>
-                <w:rFonts w:ascii="Calibri" w:cs="Calibri" w:eastAsia="Calibri" w:hAnsi="Calibri"/>
-                <w:b/>
-                <w:bCs/>
-                <w:color w:val="303832"/>
-                <w:sz w:val="16"/>
-                <w:szCs w:val="16"/>
-              </w:rPr>
-              <w:t xml:space="preserve"/>
-            </w:r>
-          </w:p>
-        </w:tc>
-        <w:tc>
-          <w:tcPr>
-            <w:tcW w:type="pct" w:w="2750"/>
-          </w:tcPr>
-          <w:p>
-            <w:pPr>
-              <w:spacing w:after="60" w:before="60" w:line="300"/>
-            </w:pPr>
-            <w:r>
-              <w:rPr>
-                <w:rFonts w:ascii="Calibri" w:cs="Calibri" w:eastAsia="Calibri" w:hAnsi="Calibri"/>
-                <w:color w:val="303832"/>
-                <w:sz w:val="22"/>
-                <w:szCs w:val="22"/>
-              </w:rPr>
-              <w:t xml:space="preserve">    4.3.6 Student Action Roadmap &amp; Offline Printable Study Plan</w:t>
-            </w:r>
-          </w:p>
-        </w:tc>
-        <w:tc>
-          <w:tcPr>
-            <w:tcW w:type="pct" w:w="750"/>
-          </w:tcPr>
-          <w:p>
-            <w:pPr>
-              <w:spacing w:after="60" w:before="60"/>
-              <w:jc w:val="center"/>
-            </w:pPr>
-            <w:r>
-              <w:rPr>
-                <w:rFonts w:ascii="Calibri" w:cs="Calibri" w:eastAsia="Calibri" w:hAnsi="Calibri"/>
-                <w:b w:val="false"/>
-                <w:bCs w:val="false"/>
-                <w:color w:val="303832"/>
-                <w:sz w:val="16"/>
-                <w:szCs w:val="16"/>
-              </w:rPr>
-              <w:t xml:space="preserve">21</w:t>
-            </w:r>
-          </w:p>
-        </w:tc>
-        <w:tc>
-          <w:tcPr>
-            <w:tcW w:type="pct" w:w="750"/>
-          </w:tcPr>
-          <w:p>
-            <w:pPr>
-              <w:spacing w:after="60" w:before="60"/>
-              <w:jc w:val="center"/>
-            </w:pPr>
-            <w:r>
-              <w:rPr>
-                <w:rFonts w:ascii="Calibri" w:cs="Calibri" w:eastAsia="Calibri" w:hAnsi="Calibri"/>
-                <w:b w:val="false"/>
-                <w:bCs w:val="false"/>
-                <w:color w:val="303832"/>
-                <w:sz w:val="16"/>
-                <w:szCs w:val="16"/>
-              </w:rPr>
-              <w:t xml:space="preserve"/>
-            </w:r>
-          </w:p>
-        </w:tc>
-      </w:tr>
-      <w:tr>
-        <w:tc>
-          <w:tcPr>
-            <w:tcW w:type="pct" w:w="750"/>
-          </w:tcPr>
-          <w:p>
-            <w:pPr>
-              <w:spacing w:after="60" w:before="60"/>
-              <w:jc w:val="center"/>
-            </w:pPr>
-            <w:r>
-              <w:rPr>
-                <w:rFonts w:ascii="Calibri" w:cs="Calibri" w:eastAsia="Calibri" w:hAnsi="Calibri"/>
-                <w:b/>
-                <w:bCs/>
-                <w:color w:val="303832"/>
-                <w:sz w:val="16"/>
-                <w:szCs w:val="16"/>
-              </w:rPr>
-              <w:t xml:space="preserve">5</w:t>
-            </w:r>
-          </w:p>
-        </w:tc>
-        <w:tc>
-          <w:tcPr>
-            <w:tcW w:type="pct" w:w="2750"/>
-          </w:tcPr>
-          <w:p>
-            <w:pPr>
-              <w:spacing w:after="60" w:before="60" w:line="300"/>
-            </w:pPr>
-            <w:r>
-              <w:rPr>
-                <w:rFonts w:ascii="Calibri" w:cs="Calibri" w:eastAsia="Calibri" w:hAnsi="Calibri"/>
-                <w:color w:val="303832"/>
-                <w:sz w:val="22"/>
-                <w:szCs w:val="22"/>
-              </w:rPr>
-              <w:t xml:space="preserve">CONCLUSION &amp; RECOMMENDATIONS</w:t>
-            </w:r>
-          </w:p>
-        </w:tc>
-        <w:tc>
-          <w:tcPr>
-            <w:tcW w:type="pct" w:w="750"/>
-          </w:tcPr>
-          <w:p>
-            <w:pPr>
-              <w:spacing w:after="60" w:before="60"/>
-              <w:jc w:val="center"/>
-            </w:pPr>
-            <w:r>
-              <w:rPr>
-                <w:rFonts w:ascii="Calibri" w:cs="Calibri" w:eastAsia="Calibri" w:hAnsi="Calibri"/>
-                <w:b w:val="false"/>
-                <w:bCs w:val="false"/>
-                <w:color w:val="303832"/>
-                <w:sz w:val="16"/>
-                <w:szCs w:val="16"/>
-              </w:rPr>
-              <w:t xml:space="preserve">22 - 23</w:t>
-            </w:r>
-          </w:p>
-        </w:tc>
-        <w:tc>
-          <w:tcPr>
-            <w:tcW w:type="pct" w:w="750"/>
-          </w:tcPr>
-          <w:p>
-            <w:pPr>
-              <w:spacing w:after="60" w:before="60"/>
-              <w:jc w:val="center"/>
-            </w:pPr>
-            <w:r>
-              <w:rPr>
-                <w:rFonts w:ascii="Calibri" w:cs="Calibri" w:eastAsia="Calibri" w:hAnsi="Calibri"/>
-                <w:b w:val="false"/>
-                <w:bCs w:val="false"/>
-                <w:color w:val="303832"/>
-                <w:sz w:val="16"/>
-                <w:szCs w:val="16"/>
-              </w:rPr>
-              <w:t xml:space="preserve"/>
-            </w:r>
-          </w:p>
-        </w:tc>
-      </w:tr>
-      <w:tr>
-        <w:tc>
-          <w:tcPr>
-            <w:tcW w:type="pct" w:w="750"/>
-          </w:tcPr>
-          <w:p>
-            <w:pPr>
-              <w:spacing w:after="60" w:before="60"/>
-              <w:jc w:val="center"/>
-            </w:pPr>
-            <w:r>
-              <w:rPr>
-                <w:rFonts w:ascii="Calibri" w:cs="Calibri" w:eastAsia="Calibri" w:hAnsi="Calibri"/>
-                <w:b/>
-                <w:bCs/>
-                <w:color w:val="303832"/>
-                <w:sz w:val="16"/>
-                <w:szCs w:val="16"/>
-              </w:rPr>
-              <w:t xml:space="preserve"/>
-            </w:r>
-          </w:p>
-        </w:tc>
-        <w:tc>
-          <w:tcPr>
-            <w:tcW w:type="pct" w:w="2750"/>
-          </w:tcPr>
-          <w:p>
-            <w:pPr>
-              <w:spacing w:after="60" w:before="60" w:line="300"/>
-            </w:pPr>
-            <w:r>
-              <w:rPr>
-                <w:rFonts w:ascii="Calibri" w:cs="Calibri" w:eastAsia="Calibri" w:hAnsi="Calibri"/>
-                <w:color w:val="303832"/>
-                <w:sz w:val="22"/>
-                <w:szCs w:val="22"/>
-              </w:rPr>
-              <w:t xml:space="preserve">5.1 Conclusion</w:t>
-            </w:r>
-          </w:p>
-        </w:tc>
-        <w:tc>
-          <w:tcPr>
-            <w:tcW w:type="pct" w:w="750"/>
-          </w:tcPr>
-          <w:p>
-            <w:pPr>
-              <w:spacing w:after="60" w:before="60"/>
-              <w:jc w:val="center"/>
-            </w:pPr>
-            <w:r>
-              <w:rPr>
-                <w:rFonts w:ascii="Calibri" w:cs="Calibri" w:eastAsia="Calibri" w:hAnsi="Calibri"/>
-                <w:b w:val="false"/>
-                <w:bCs w:val="false"/>
-                <w:color w:val="303832"/>
-                <w:sz w:val="16"/>
-                <w:szCs w:val="16"/>
-              </w:rPr>
-              <w:t xml:space="preserve">22</w:t>
-            </w:r>
-          </w:p>
-        </w:tc>
-        <w:tc>
-          <w:tcPr>
-            <w:tcW w:type="pct" w:w="750"/>
-          </w:tcPr>
-          <w:p>
-            <w:pPr>
-              <w:spacing w:after="60" w:before="60"/>
-              <w:jc w:val="center"/>
-            </w:pPr>
-            <w:r>
-              <w:rPr>
-                <w:rFonts w:ascii="Calibri" w:cs="Calibri" w:eastAsia="Calibri" w:hAnsi="Calibri"/>
-                <w:b w:val="false"/>
-                <w:bCs w:val="false"/>
-                <w:color w:val="303832"/>
-                <w:sz w:val="16"/>
-                <w:szCs w:val="16"/>
-              </w:rPr>
-              <w:t xml:space="preserve"/>
-            </w:r>
-          </w:p>
-        </w:tc>
-      </w:tr>
-      <w:tr>
-        <w:tc>
-          <w:tcPr>
-            <w:tcW w:type="pct" w:w="750"/>
-          </w:tcPr>
-          <w:p>
-            <w:pPr>
-              <w:spacing w:after="60" w:before="60"/>
-              <w:jc w:val="center"/>
-            </w:pPr>
-            <w:r>
-              <w:rPr>
-                <w:rFonts w:ascii="Calibri" w:cs="Calibri" w:eastAsia="Calibri" w:hAnsi="Calibri"/>
-                <w:b/>
-                <w:bCs/>
-                <w:color w:val="303832"/>
-                <w:sz w:val="16"/>
-                <w:szCs w:val="16"/>
-              </w:rPr>
-              <w:t xml:space="preserve"/>
-            </w:r>
-          </w:p>
-        </w:tc>
-        <w:tc>
-          <w:tcPr>
-            <w:tcW w:type="pct" w:w="2750"/>
-          </w:tcPr>
-          <w:p>
-            <w:pPr>
-              <w:spacing w:after="60" w:before="60" w:line="300"/>
-            </w:pPr>
-            <w:r>
-              <w:rPr>
-                <w:rFonts w:ascii="Calibri" w:cs="Calibri" w:eastAsia="Calibri" w:hAnsi="Calibri"/>
-                <w:color w:val="303832"/>
-                <w:sz w:val="22"/>
-                <w:szCs w:val="22"/>
-              </w:rPr>
-              <w:t xml:space="preserve">5.2 Recommendations and Future Enhancements</w:t>
-            </w:r>
-          </w:p>
-        </w:tc>
-        <w:tc>
-          <w:tcPr>
-            <w:tcW w:type="pct" w:w="750"/>
-          </w:tcPr>
-          <w:p>
-            <w:pPr>
-              <w:spacing w:after="60" w:before="60"/>
-              <w:jc w:val="center"/>
-            </w:pPr>
-            <w:r>
-              <w:rPr>
-                <w:rFonts w:ascii="Calibri" w:cs="Calibri" w:eastAsia="Calibri" w:hAnsi="Calibri"/>
-                <w:b w:val="false"/>
-                <w:bCs w:val="false"/>
-                <w:color w:val="303832"/>
-                <w:sz w:val="16"/>
-                <w:szCs w:val="16"/>
-              </w:rPr>
-              <w:t xml:space="preserve">23</w:t>
-            </w:r>
-          </w:p>
-        </w:tc>
-        <w:tc>
-          <w:tcPr>
-            <w:tcW w:type="pct" w:w="750"/>
-          </w:tcPr>
-          <w:p>
-            <w:pPr>
-              <w:spacing w:after="60" w:before="60"/>
-              <w:jc w:val="center"/>
-            </w:pPr>
-            <w:r>
-              <w:rPr>
-                <w:rFonts w:ascii="Calibri" w:cs="Calibri" w:eastAsia="Calibri" w:hAnsi="Calibri"/>
-                <w:b w:val="false"/>
-                <w:bCs w:val="false"/>
-                <w:color w:val="303832"/>
-                <w:sz w:val="16"/>
-                <w:szCs w:val="16"/>
-              </w:rPr>
-              <w:t xml:space="preserve"/>
-            </w:r>
-          </w:p>
-        </w:tc>
-      </w:tr>
-      <w:tr>
-        <w:tc>
-          <w:tcPr>
-            <w:tcW w:type="pct" w:w="750"/>
-          </w:tcPr>
-          <w:p>
-            <w:pPr>
-              <w:spacing w:after="60" w:before="60"/>
-              <w:jc w:val="center"/>
-            </w:pPr>
-            <w:r>
-              <w:rPr>
-                <w:rFonts w:ascii="Calibri" w:cs="Calibri" w:eastAsia="Calibri" w:hAnsi="Calibri"/>
-                <w:b/>
-                <w:bCs/>
-                <w:color w:val="303832"/>
-                <w:sz w:val="16"/>
-                <w:szCs w:val="16"/>
-              </w:rPr>
-              <w:t xml:space="preserve">6</w:t>
-            </w:r>
-          </w:p>
-        </w:tc>
-        <w:tc>
-          <w:tcPr>
-            <w:tcW w:type="pct" w:w="2750"/>
-          </w:tcPr>
-          <w:p>
-            <w:pPr>
-              <w:spacing w:after="60" w:before="60" w:line="300"/>
-            </w:pPr>
-            <w:r>
-              <w:rPr>
-                <w:rFonts w:ascii="Calibri" w:cs="Calibri" w:eastAsia="Calibri" w:hAnsi="Calibri"/>
-                <w:color w:val="303832"/>
-                <w:sz w:val="22"/>
-                <w:szCs w:val="22"/>
-              </w:rPr>
-              <w:t xml:space="preserve">REFERENCES &amp; BIBLIOGRAPHY</w:t>
+              <w:t xml:space="preserve">References</w:t>
             </w:r>
           </w:p>
         </w:tc>
@@ -7349,7 +6566,7 @@
           <w:sz w:val="22"/>
           <w:szCs w:val="22"/>
         </w:rPr>
-        <w:t xml:space="preserve">In India today, career selection remains one of the most critical determinants of socio-economic mobility. However, access to professional career counselling is overwhelmingly concentrated in affluent urban areas and expensive private schools. For millions of students studying in government schools, rural communities, municipal junior colleges, and low-income households across Mumbai suburbs (such as Govandi, Chembur, and Mankhurd) and broader Maharashtra, reliable career advice is almost non-existent. First-generation college learners frequently struggle to navigate the complex maze of educational choices, admissions procedures, and financial assistance schemes.</w:t>
+        <w:t xml:space="preserve">Choosing the right career after school or junior college is one of the biggest decisions in a student’s life. In our city, Mumbai, and especially in areas like Chembur, Govandi, and Mankhurd, many families work very hard in small jobs, driving autos, running tea stalls, or working as daily wage earners. Most parents in these neighborhoods have never been to college, so they cannot give detailed academic advice to their children. Students studying in municipal schools and government-aided junior colleges often have to figure everything out on their own.</w:t>
       </w:r>
     </w:p>
     <w:p>
@@ -7363,7 +6580,7 @@
           <w:sz w:val="22"/>
           <w:szCs w:val="22"/>
         </w:rPr>
-        <w:t xml:space="preserve">A pervasive misconception exists that the only viable paths to dignified employment are expensive private engineering or medical degrees. Consequently, families often incur crippling non-institutional debt to pay private college tuition fees, unaware of high-quality government institutions, polytechnic diplomas, Industrial Training Institutes (ITI), and state-sponsored scholarship schemes like MahaDBT. When students cannot afford private coaching or expensive degree programmes, they often drop out prematurely or take up low-skill informal jobs, failing to realize their full potential.</w:t>
+        <w:t xml:space="preserve">When students complete their 10th or 12th standard, they usually only hear about medical or engineering. But private engineering or medical college fees can easily cost ₹1,00,000 to ₹3,00,000 every year, not including coaching classes. Because their families cannot afford such amounts, many students feel discouraged and think higher education is not for them. Some take up random low-paying delivery jobs or small shop work, while others drop out simply because they did not know about affordable government colleges, ITI trades, polytechnic diplomas, or government scholarships.</w:t>
       </w:r>
     </w:p>
     <w:p>
@@ -7377,7 +6594,21 @@
           <w:sz w:val="22"/>
           <w:szCs w:val="22"/>
         </w:rPr>
-        <w:t xml:space="preserve">The project “UDAAN — Online Career Guidance Portal for Underprivileged Students” is conceived and developed to solve this institutional disparity. Designed with the core ethos “Your dreams deserve a direction,” Udaan provides an open, free, accessible, and multilingual digital guidance platform. Built using modern web technologies (React 19, TypeScript, Vite, and accessible HTML5/CSS3), Udaan demystifies the Indian educational architecture, maps low-cost government college pathways, aggregates official state and central scholarships, offers an automated 6-step guided assessment, and connects students with verified volunteer mentors under strict minor-safeguarding protocols.</w:t>
+        <w:t xml:space="preserve">The project Udaan – Online Career Guidance Portal for Underprivileged Students was built to solve this exact problem. The word "Udaan" means flight, and our tagline is “Your dreams deserve a direction.” The main goal of this web application is to give students honest, clear, and practical career guidance that does not push them toward expensive private universities. Instead, it explains how the actual Indian education system works, lists real government college fees, shows verified scholarships on portals like MahaDBT and the National Scholarship Portal, and helps students find a realistic pathway based on their family’s budget.</w:t>
+      </w:r>
+    </w:p>
+    <w:p>
+      <w:pPr>
+        <w:spacing w:after="60" w:before="60" w:line="300"/>
+      </w:pPr>
+      <w:r>
+        <w:rPr>
+          <w:rFonts w:ascii="Calibri" w:cs="Calibri" w:eastAsia="Calibri" w:hAnsi="Calibri"/>
+          <w:color w:val="303832"/>
+          <w:sz w:val="22"/>
+          <w:szCs w:val="22"/>
+        </w:rPr>
+        <w:t xml:space="preserve">The project is built using modern web development technologies including React, TypeScript, HTML, CSS, and Vite. It is designed to work quickly on budget smartphones, requires very little internet data, and can be used in English, Hindi, and Marathi. It also includes an audio reader feature for students or parents who have difficulty reading long paragraphs of text on a screen.</w:t>
       </w:r>
     </w:p>
     <w:p>
@@ -7394,7 +6625,7 @@
           <w:sz w:val="24"/>
           <w:szCs w:val="24"/>
         </w:rPr>
-        <w:t xml:space="preserve">1.1 Existing System</w:t>
+        <w:t xml:space="preserve">1.1 Existing System:</w:t>
       </w:r>
     </w:p>
     <w:p>
@@ -7408,7 +6639,21 @@
           <w:sz w:val="22"/>
           <w:szCs w:val="22"/>
         </w:rPr>
-        <w:t xml:space="preserve">In the existing ecosystem, students from underprivileged backgrounds rely on unstructured advice from relatives, peers, or sensationalized social media content. The traditional landscape exhibits several systemic weaknesses:</w:t>
+        <w:t xml:space="preserve">In the existing system, students from municipal schools and low-income families mostly rely on informal advice from friends, relatives, or random videos on social media. Some look at education websites or coaching advertisements, while others try to search online on their mobile phones.</w:t>
+      </w:r>
+    </w:p>
+    <w:p>
+      <w:pPr>
+        <w:spacing w:after="60" w:before="60" w:line="300"/>
+      </w:pPr>
+      <w:r>
+        <w:rPr>
+          <w:rFonts w:ascii="Calibri" w:cs="Calibri" w:eastAsia="Calibri" w:hAnsi="Calibri"/>
+          <w:color w:val="303832"/>
+          <w:sz w:val="22"/>
+          <w:szCs w:val="22"/>
+        </w:rPr>
+        <w:t xml:space="preserve">Although these methods can sometimes provide bits of information, they have several serious problems for students who lack proper guidance:</w:t>
       </w:r>
     </w:p>
     <w:p>
@@ -7429,16 +6674,16 @@
           <w:sz w:val="22"/>
           <w:szCs w:val="22"/>
         </w:rPr>
-        <w:t xml:space="preserve">Prohibitive Counselling Costs:</w:t>
-      </w:r>
-      <w:r>
-        <w:rPr>
-          <w:rFonts w:ascii="Calibri" w:cs="Calibri" w:eastAsia="Calibri" w:hAnsi="Calibri"/>
-          <w:color w:val="303832"/>
-          <w:sz w:val="22"/>
-          <w:szCs w:val="22"/>
-        </w:rPr>
-        <w:t xml:space="preserve"> Commercial career counsellors charge between ₹3,000 and ₹25,000 for psychometric evaluations, rendering them completely out of reach for families earning less than ₹2.5 Lakhs annually.</w:t>
+        <w:t xml:space="preserve">Private Counselling is Too Expensive:</w:t>
+      </w:r>
+      <w:r>
+        <w:rPr>
+          <w:rFonts w:ascii="Calibri" w:cs="Calibri" w:eastAsia="Calibri" w:hAnsi="Calibri"/>
+          <w:color w:val="303832"/>
+          <w:sz w:val="22"/>
+          <w:szCs w:val="22"/>
+        </w:rPr>
+        <w:t xml:space="preserve"> Professional career counselling centres and private aptitude testing companies charge anywhere between ₹2,000 and ₹15,000 for one or two sessions. Families earning less than ₹15,000 to ₹20,000 a month cannot spend their hard-earned money on counselling.</w:t>
       </w:r>
     </w:p>
     <w:p>
@@ -7459,16 +6704,16 @@
           <w:sz w:val="22"/>
           <w:szCs w:val="22"/>
         </w:rPr>
-        <w:t xml:space="preserve">Severe Information Asymmetry on Scholarships:</w:t>
-      </w:r>
-      <w:r>
-        <w:rPr>
-          <w:rFonts w:ascii="Calibri" w:cs="Calibri" w:eastAsia="Calibri" w:hAnsi="Calibri"/>
-          <w:color w:val="303832"/>
-          <w:sz w:val="22"/>
-          <w:szCs w:val="22"/>
-        </w:rPr>
-        <w:t xml:space="preserve"> While the Government of Maharashtra runs extensive welfare schemes on MahaDBT (such as the Rajarshi Chhatrapati Shahu Maharaj Shikshan Shulkh Shishyavrutti Yojna covering 50% to 100% tuition fees), over 70% of eligible students in municipal schools are unaware of eligibility ceilings, required certificates, or application timelines.</w:t>
+        <w:t xml:space="preserve">Commercial Websites Promote Private Colleges:</w:t>
+      </w:r>
+      <w:r>
+        <w:rPr>
+          <w:rFonts w:ascii="Calibri" w:cs="Calibri" w:eastAsia="Calibri" w:hAnsi="Calibri"/>
+          <w:color w:val="303832"/>
+          <w:sz w:val="22"/>
+          <w:szCs w:val="22"/>
+        </w:rPr>
+        <w:t xml:space="preserve"> Most popular educational websites earn money by showing paid advertisements for private colleges. They rarely tell students about low-cost government polytechnics, government ITIs, or university-affiliated aided colleges.</w:t>
       </w:r>
     </w:p>
     <w:p>
@@ -7489,16 +6734,16 @@
           <w:sz w:val="22"/>
           <w:szCs w:val="22"/>
         </w:rPr>
-        <w:t xml:space="preserve">Linguistic Barrier:</w:t>
-      </w:r>
-      <w:r>
-        <w:rPr>
-          <w:rFonts w:ascii="Calibri" w:cs="Calibri" w:eastAsia="Calibri" w:hAnsi="Calibri"/>
-          <w:color w:val="303832"/>
-          <w:sz w:val="22"/>
-          <w:szCs w:val="22"/>
-        </w:rPr>
-        <w:t xml:space="preserve"> Most national education portals operate strictly in English, using dense bureaucratic terminology. Students and parents fluent only in Hindi or Marathi are unable to decipher course eligibility or document requirements.</w:t>
+        <w:t xml:space="preserve">Lack of Scholarship Awareness:</w:t>
+      </w:r>
+      <w:r>
+        <w:rPr>
+          <w:rFonts w:ascii="Calibri" w:cs="Calibri" w:eastAsia="Calibri" w:hAnsi="Calibri"/>
+          <w:color w:val="303832"/>
+          <w:sz w:val="22"/>
+          <w:szCs w:val="22"/>
+        </w:rPr>
+        <w:t xml:space="preserve"> The Maharashtra Government runs helpful schemes on the MahaDBT portal (such as fee concessions for EBC, OBC, SC, and ST students), and the Central Government has the National Scholarship Portal. But many students miss the application dates because they do not know what documents (like Tahsildar income certificate, domicile, or caste validity) are required beforehand.</w:t>
       </w:r>
     </w:p>
     <w:p>
@@ -7519,16 +6764,16 @@
           <w:sz w:val="22"/>
           <w:szCs w:val="22"/>
         </w:rPr>
-        <w:t xml:space="preserve">Stigmatization of Vocational &amp; Alternative Routes:</w:t>
-      </w:r>
-      <w:r>
-        <w:rPr>
-          <w:rFonts w:ascii="Calibri" w:cs="Calibri" w:eastAsia="Calibri" w:hAnsi="Calibri"/>
-          <w:color w:val="303832"/>
-          <w:sz w:val="22"/>
-          <w:szCs w:val="22"/>
-        </w:rPr>
-        <w:t xml:space="preserve"> Existing portals prioritize tier-1 engineering and medical colleges. Affordable ITI certifications, polytechnic lateral admissions, paramedical diplomas, and open schooling (NIOS) are neglected or presented as inferior options.</w:t>
+        <w:t xml:space="preserve">Language and Technical Terms:</w:t>
+      </w:r>
+      <w:r>
+        <w:rPr>
+          <w:rFonts w:ascii="Calibri" w:cs="Calibri" w:eastAsia="Calibri" w:hAnsi="Calibri"/>
+          <w:color w:val="303832"/>
+          <w:sz w:val="22"/>
+          <w:szCs w:val="22"/>
+        </w:rPr>
+        <w:t xml:space="preserve"> Most official notices and career portals are written in complex English or dense administrative language. Students who studied in Marathi or Hindi medium schools find it difficult to understand terms like "CAP rounds", "domicile", "EWS", or "creamy layer".</w:t>
       </w:r>
     </w:p>
     <w:p>
@@ -7549,16 +6794,30 @@
           <w:sz w:val="22"/>
           <w:szCs w:val="22"/>
         </w:rPr>
-        <w:t xml:space="preserve">Digital Exploitation &amp; Unverified Guidance:</w:t>
-      </w:r>
-      <w:r>
-        <w:rPr>
-          <w:rFonts w:ascii="Calibri" w:cs="Calibri" w:eastAsia="Calibri" w:hAnsi="Calibri"/>
-          <w:color w:val="303832"/>
-          <w:sz w:val="22"/>
-          <w:szCs w:val="22"/>
-        </w:rPr>
-        <w:t xml:space="preserve"> Students frequently fall prey to fraudulent job guarantees, unaccredited private diploma mills, and phishing portals masquerading as scholarship websites.</w:t>
+        <w:t xml:space="preserve">Risk of Scams and Fake Promises:</w:t>
+      </w:r>
+      <w:r>
+        <w:rPr>
+          <w:rFonts w:ascii="Calibri" w:cs="Calibri" w:eastAsia="Calibri" w:hAnsi="Calibri"/>
+          <w:color w:val="303832"/>
+          <w:sz w:val="22"/>
+          <w:szCs w:val="22"/>
+        </w:rPr>
+        <w:t xml:space="preserve"> Many private coaching centres make unrealistic promises like "100% job guarantee with ₹50,000 salary in 6 months". Students who don’t know better end up wasting their family savings on unaccredited courses.</w:t>
+      </w:r>
+    </w:p>
+    <w:p>
+      <w:pPr>
+        <w:spacing w:after="60" w:before="60" w:line="300"/>
+      </w:pPr>
+      <w:r>
+        <w:rPr>
+          <w:rFonts w:ascii="Calibri" w:cs="Calibri" w:eastAsia="Calibri" w:hAnsi="Calibri"/>
+          <w:color w:val="303832"/>
+          <w:sz w:val="22"/>
+          <w:szCs w:val="22"/>
+        </w:rPr>
+        <w:t xml:space="preserve">Therefore, there is an urgent need for a free, simple, and honest website that guides underprivileged students in their own language without pushing expensive courses.</w:t>
       </w:r>
     </w:p>
     <w:p>
@@ -7575,7 +6834,7 @@
           <w:sz w:val="24"/>
           <w:szCs w:val="24"/>
         </w:rPr>
-        <w:t xml:space="preserve">1.2 Proposed System</w:t>
+        <w:t xml:space="preserve">1.2 Proposed System:</w:t>
       </w:r>
     </w:p>
     <w:p>
@@ -7589,7 +6848,21 @@
           <w:sz w:val="22"/>
           <w:szCs w:val="22"/>
         </w:rPr>
-        <w:t xml:space="preserve">The proposed Udaan portal is an inclusive, centralized career ecosystem architected specifically around the realities of the Indian education landscape and low-income student needs. Key highlights of the proposed system include:</w:t>
+        <w:t xml:space="preserve">The proposed system, Udaan – Online Career Guidance Portal for Underprivileged Students, is an open-access web application created to make career counselling easy, accessible, and practical for every Indian student.</w:t>
+      </w:r>
+    </w:p>
+    <w:p>
+      <w:pPr>
+        <w:spacing w:after="60" w:before="60" w:line="300"/>
+      </w:pPr>
+      <w:r>
+        <w:rPr>
+          <w:rFonts w:ascii="Calibri" w:cs="Calibri" w:eastAsia="Calibri" w:hAnsi="Calibri"/>
+          <w:color w:val="303832"/>
+          <w:sz w:val="22"/>
+          <w:szCs w:val="22"/>
+        </w:rPr>
+        <w:t xml:space="preserve">The application provides a clear, step-by-step guidance interface that addresses the shortcomings of the existing system:</w:t>
       </w:r>
     </w:p>
     <w:p>
@@ -7610,16 +6883,16 @@
           <w:sz w:val="22"/>
           <w:szCs w:val="22"/>
         </w:rPr>
-        <w:t xml:space="preserve">Full Education Hierarchy Mapping:</w:t>
-      </w:r>
-      <w:r>
-        <w:rPr>
-          <w:rFonts w:ascii="Calibri" w:cs="Calibri" w:eastAsia="Calibri" w:hAnsi="Calibri"/>
-          <w:color w:val="303832"/>
-          <w:sz w:val="22"/>
-          <w:szCs w:val="22"/>
-        </w:rPr>
-        <w:t xml:space="preserve"> From Class 9-10 foundation, Class 11-12 streams (Arts, Commerce, Science), ITI trades, polytechnic diplomas, to undergraduate professional degrees (B.Sc IT, BCA, B.Tech, Nursing, Pharmacy) and civil service examinations.</w:t>
+        <w:t xml:space="preserve">Realistic Education Pathways:</w:t>
+      </w:r>
+      <w:r>
+        <w:rPr>
+          <w:rFonts w:ascii="Calibri" w:cs="Calibri" w:eastAsia="Calibri" w:hAnsi="Calibri"/>
+          <w:color w:val="303832"/>
+          <w:sz w:val="22"/>
+          <w:szCs w:val="22"/>
+        </w:rPr>
+        <w:t xml:space="preserve"> Udaan covers all practical routes after 10th and 12th: Arts, Commerce, Science, ITI trades (such as Electrician, Fitter, and COPA), Polytechnic 3-year diplomas, undergraduate degrees (BA, BCom, BSc, BSc IT, BCA, BTech, Nursing, Pharmacy), open schooling (NIOS), and competitive government exams (UPSC, SSC, Railway Recruitment, Police, and Banking).</w:t>
       </w:r>
     </w:p>
     <w:p>
@@ -7640,16 +6913,16 @@
           <w:sz w:val="22"/>
           <w:szCs w:val="22"/>
         </w:rPr>
-        <w:t xml:space="preserve">Fee Reality Checks &amp; Government College Prioritization:</w:t>
-      </w:r>
-      <w:r>
-        <w:rPr>
-          <w:rFonts w:ascii="Calibri" w:cs="Calibri" w:eastAsia="Calibri" w:hAnsi="Calibri"/>
-          <w:color w:val="303832"/>
-          <w:sz w:val="22"/>
-          <w:szCs w:val="22"/>
-        </w:rPr>
-        <w:t xml:space="preserve"> Every career page transparently displays indicative government college fee structures, source-verified course costs, and realistic entry-level versus senior salary brackets, explicitly refuting false salary guarantees.</w:t>
+        <w:t xml:space="preserve">Fee Reality Checks:</w:t>
+      </w:r>
+      <w:r>
+        <w:rPr>
+          <w:rFonts w:ascii="Calibri" w:cs="Calibri" w:eastAsia="Calibri" w:hAnsi="Calibri"/>
+          <w:color w:val="303832"/>
+          <w:sz w:val="22"/>
+          <w:szCs w:val="22"/>
+        </w:rPr>
+        <w:t xml:space="preserve"> Instead of hiding college fees, each career page clearly shows how much a government college costs compared to a private college, along with realistic starting salaries. This prevents students and parents from falling into debt traps.</w:t>
       </w:r>
     </w:p>
     <w:p>
@@ -7670,16 +6943,16 @@
           <w:sz w:val="22"/>
           <w:szCs w:val="22"/>
         </w:rPr>
-        <w:t xml:space="preserve">Dedicated MahaDBT &amp; Central NSP Scholarship Discovery:</w:t>
-      </w:r>
-      <w:r>
-        <w:rPr>
-          <w:rFonts w:ascii="Calibri" w:cs="Calibri" w:eastAsia="Calibri" w:hAnsi="Calibri"/>
-          <w:color w:val="303832"/>
-          <w:sz w:val="22"/>
-          <w:szCs w:val="22"/>
-        </w:rPr>
-        <w:t xml:space="preserve"> Direct integration with Maharashtra State (MahaDBT) and National Scholarship Portal (NSP) schemes, categorizing aid by caste (SC/ST/OBC), income (EWS), gender, and disability, complete with a step-by-step document readiness checklist.</w:t>
+        <w:t xml:space="preserve">MahaDBT and Central Scholarship Finder:</w:t>
+      </w:r>
+      <w:r>
+        <w:rPr>
+          <w:rFonts w:ascii="Calibri" w:cs="Calibri" w:eastAsia="Calibri" w:hAnsi="Calibri"/>
+          <w:color w:val="303832"/>
+          <w:sz w:val="22"/>
+          <w:szCs w:val="22"/>
+        </w:rPr>
+        <w:t xml:space="preserve"> The scholarship section lets students filter opportunities specifically for Maharashtra (MahaDBT) and Central schemes (NSP). It displays the income limit, eligible categories, deadline, official website link, and an easy document checklist.</w:t>
       </w:r>
     </w:p>
     <w:p>
@@ -7700,16 +6973,16 @@
           <w:sz w:val="22"/>
           <w:szCs w:val="22"/>
         </w:rPr>
-        <w:t xml:space="preserve">Interactive 6-Step Guided Career Assessment:</w:t>
-      </w:r>
-      <w:r>
-        <w:rPr>
-          <w:rFonts w:ascii="Calibri" w:cs="Calibri" w:eastAsia="Calibri" w:hAnsi="Calibri"/>
-          <w:color w:val="303832"/>
-          <w:sz w:val="22"/>
-          <w:szCs w:val="22"/>
-        </w:rPr>
-        <w:t xml:space="preserve"> An algorithm that takes student qualifications, subject inclinations, preferred sectors, and annual family budget limits to recommend attainable, zero-debt career pathways alongside alternative vocational routes.</w:t>
+        <w:t xml:space="preserve">Guided 6-Step Career Quiz:</w:t>
+      </w:r>
+      <w:r>
+        <w:rPr>
+          <w:rFonts w:ascii="Calibri" w:cs="Calibri" w:eastAsia="Calibri" w:hAnsi="Calibri"/>
+          <w:color w:val="303832"/>
+          <w:sz w:val="22"/>
+          <w:szCs w:val="22"/>
+        </w:rPr>
+        <w:t xml:space="preserve"> Students who are confused can take a quick 6-question assessment. The system asks for their current qualification, subjects they enjoy, and their family’s annual education budget. If a student has a very low budget (under ₹25,000 per year), the system automatically suggests affordable government colleges or ITI-to-polytechnic routes.</w:t>
       </w:r>
     </w:p>
     <w:p>
@@ -7730,16 +7003,16 @@
           <w:sz w:val="22"/>
           <w:szCs w:val="22"/>
         </w:rPr>
-        <w:t xml:space="preserve">Multilingual &amp; Digital Literacy Accommodations:</w:t>
-      </w:r>
-      <w:r>
-        <w:rPr>
-          <w:rFonts w:ascii="Calibri" w:cs="Calibri" w:eastAsia="Calibri" w:hAnsi="Calibri"/>
-          <w:color w:val="303832"/>
-          <w:sz w:val="22"/>
-          <w:szCs w:val="22"/>
-        </w:rPr>
-        <w:t xml:space="preserve"> Instant switching between English, Hindi (हिन्दी), and Marathi (मराठी), assisted by automated browser speech narration and an interactive Jargon Buster (Glossary) explaining terms like DBT, EWS, CAP Rounds, and NIOS.</w:t>
+        <w:t xml:space="preserve">Multilingual &amp; Audio Support:</w:t>
+      </w:r>
+      <w:r>
+        <w:rPr>
+          <w:rFonts w:ascii="Calibri" w:cs="Calibri" w:eastAsia="Calibri" w:hAnsi="Calibri"/>
+          <w:color w:val="303832"/>
+          <w:sz w:val="22"/>
+          <w:szCs w:val="22"/>
+        </w:rPr>
+        <w:t xml:space="preserve"> The entire website can be switched between English, Hindi, and Marathi with one click. An audio narration button uses the browser speech feature to read aloud the guidance for parents who cannot read easily.</w:t>
       </w:r>
     </w:p>
     <w:p>
@@ -7760,16 +7033,16 @@
           <w:sz w:val="22"/>
           <w:szCs w:val="22"/>
         </w:rPr>
-        <w:t xml:space="preserve">Safeguarded Mentorship Framework:</w:t>
-      </w:r>
-      <w:r>
-        <w:rPr>
-          <w:rFonts w:ascii="Calibri" w:cs="Calibri" w:eastAsia="Calibri" w:hAnsi="Calibri"/>
-          <w:color w:val="303832"/>
-          <w:sz w:val="22"/>
-          <w:szCs w:val="22"/>
-        </w:rPr>
-        <w:t xml:space="preserve"> A directory of police- and background-verified volunteer professionals, career counsellors, and alumni. For minors (under 18), mandatory guardian consent declarations are enforced before any session request can be submitted.</w:t>
+        <w:t xml:space="preserve">Human Mentorship with Child Safeguarding:</w:t>
+      </w:r>
+      <w:r>
+        <w:rPr>
+          <w:rFonts w:ascii="Calibri" w:cs="Calibri" w:eastAsia="Calibri" w:hAnsi="Calibri"/>
+          <w:color w:val="303832"/>
+          <w:sz w:val="22"/>
+          <w:szCs w:val="22"/>
+        </w:rPr>
+        <w:t xml:space="preserve"> Students can browse profiles of verified volunteer mentors (teachers, counsellors, and professionals). If a student is under 18 years old, the website asks for parent/guardian permission before booking a session, and private phone numbers are kept hidden for safety.</w:t>
       </w:r>
     </w:p>
     <w:p>
@@ -7790,16 +7063,16 @@
           <w:sz w:val="22"/>
           <w:szCs w:val="22"/>
         </w:rPr>
-        <w:t xml:space="preserve">Offline Study Action Plan:</w:t>
-      </w:r>
-      <w:r>
-        <w:rPr>
-          <w:rFonts w:ascii="Calibri" w:cs="Calibri" w:eastAsia="Calibri" w:hAnsi="Calibri"/>
-          <w:color w:val="303832"/>
-          <w:sz w:val="22"/>
-          <w:szCs w:val="22"/>
-        </w:rPr>
-        <w:t xml:space="preserve"> Students can save milestones to browser LocalStorage and generate a printable, lightweight PDF study roadmap for offline reference in areas with unstable internet connectivity.</w:t>
+        <w:t xml:space="preserve">My Roadmap &amp; Printable Study Plan:</w:t>
+      </w:r>
+      <w:r>
+        <w:rPr>
+          <w:rFonts w:ascii="Calibri" w:cs="Calibri" w:eastAsia="Calibri" w:hAnsi="Calibri"/>
+          <w:color w:val="303832"/>
+          <w:sz w:val="22"/>
+          <w:szCs w:val="22"/>
+        </w:rPr>
+        <w:t xml:space="preserve"> Students can save their favorite careers to a personal checklist. They can also click a "Print / Save PDF" button to print a neat paper copy to keep at home, which is very helpful when internet data is limited.</w:t>
       </w:r>
     </w:p>
     <w:p>
@@ -7816,7 +7089,7 @@
           <w:sz w:val="24"/>
           <w:szCs w:val="24"/>
         </w:rPr>
-        <w:t xml:space="preserve">1.3 Normal Photos &amp; Geotag Photos</w:t>
+        <w:t xml:space="preserve">1.3 Normal Photos &amp; Geotag Photos:</w:t>
       </w:r>
     </w:p>
     <w:p>
@@ -7830,7 +7103,7 @@
           <w:sz w:val="22"/>
           <w:szCs w:val="22"/>
         </w:rPr>
-        <w:t xml:space="preserve">To ground the technical development of Udaan in real community needs, extensive field research and interactive demonstrations were conducted across Chembur, Govandi Slums, and ACC Nagar community study centres in Mumbai. These sessions engaged secondary school students, ITI trainees, and parents to evaluate digital literacy, interface accessibility, and linguistic comprehension.</w:t>
+        <w:t xml:space="preserve">During our Community Engagement Program (CEP), we visited local community centres, tuition rooms, and open study spaces in Chembur and Govandi to talk to students who recently passed their 10th and 12th board exams. We showed them the Udaan portal on a laptop and mobile phones to see if they could easily understand the options and find scholarships.</w:t>
       </w:r>
     </w:p>
     <w:p>
@@ -7847,7 +7120,7 @@
           <w:sz w:val="20"/>
           <w:szCs w:val="20"/>
         </w:rPr>
-        <w:t xml:space="preserve">Normal Community Outreach Photos:</w:t>
+        <w:t xml:space="preserve">Normal Photos:</w:t>
       </w:r>
     </w:p>
     <w:p>
@@ -7910,7 +7183,7 @@
           <w:sz w:val="18"/>
           <w:szCs w:val="18"/>
         </w:rPr>
-        <w:t xml:space="preserve">Plate 1.1: Local community education and youth training center near Chembur-Govandi</w:t>
+        <w:t xml:space="preserve">Plate 1.1: Local youth and student community centre near Chembur-Govandi area</w:t>
       </w:r>
     </w:p>
     <w:p>
@@ -7973,7 +7246,7 @@
           <w:sz w:val="18"/>
           <w:szCs w:val="18"/>
         </w:rPr>
-        <w:t xml:space="preserve">Plate 1.2: Interactive career awareness engagement session with local youth</w:t>
+        <w:t xml:space="preserve">Plate 1.2: Interacting with local students and discussing post-SSC/HSC career options</w:t>
       </w:r>
     </w:p>
     <w:p>
@@ -7990,7 +7263,7 @@
           <w:sz w:val="20"/>
           <w:szCs w:val="20"/>
         </w:rPr>
-        <w:t xml:space="preserve">Geotag Photos (Field Verification with GPS Map Camera):</w:t>
+        <w:t xml:space="preserve">Geotag Photos:</w:t>
       </w:r>
     </w:p>
     <w:p>
@@ -8116,7 +7389,7 @@
           <w:sz w:val="18"/>
           <w:szCs w:val="18"/>
         </w:rPr>
-        <w:t xml:space="preserve">Plate 1.4: GPS Geotag Photo — Hands-on testing of Udaan Portal with first-generation college students (Lat: 19.062128°, Long: 72.917072°)</w:t>
+        <w:t xml:space="preserve">Plate 1.4: GPS Geotag Photo — Demonstrating Udaan portal and checking MahaDBT scholarships with students (Lat: 19.062128°, Long: 72.917072°)</w:t>
       </w:r>
     </w:p>
     <w:p>
@@ -8133,7 +7406,7 @@
           <w:sz w:val="24"/>
           <w:szCs w:val="24"/>
         </w:rPr>
-        <w:t xml:space="preserve">1.4 Key Findings</w:t>
+        <w:t xml:space="preserve">1.4 Key Findings:</w:t>
       </w:r>
     </w:p>
     <w:p>
@@ -8147,7 +7420,7 @@
           <w:sz w:val="22"/>
           <w:szCs w:val="22"/>
         </w:rPr>
-        <w:t xml:space="preserve">The community engagement sessions and initial system audits yielded several fundamental insights regarding career guidance for low-income students:</w:t>
+        <w:t xml:space="preserve">Our fieldwork in Chembur and Govandi helped us understand the ground reality faced by students from low-income families:</w:t>
       </w:r>
     </w:p>
     <w:p>
@@ -8168,16 +7441,16 @@
           <w:sz w:val="22"/>
           <w:szCs w:val="22"/>
         </w:rPr>
-        <w:t xml:space="preserve">High Demand for Vocational Trades:</w:t>
-      </w:r>
-      <w:r>
-        <w:rPr>
-          <w:rFonts w:ascii="Calibri" w:cs="Calibri" w:eastAsia="Calibri" w:hAnsi="Calibri"/>
-          <w:color w:val="303832"/>
-          <w:sz w:val="22"/>
-          <w:szCs w:val="22"/>
-        </w:rPr>
-        <w:t xml:space="preserve"> Over 62% of surveyed students in Govandi indicated an urgent need to begin contributing to household income within 1-2 years after Class 10/12, making ITI (Electrician, Fitter, Computer Operator) and Polytechnic Diploma paths vastly more attractive than 4-year general degrees.</w:t>
+        <w:t xml:space="preserve">1. Earning Early is a Major Priority:</w:t>
+      </w:r>
+      <w:r>
+        <w:rPr>
+          <w:rFonts w:ascii="Calibri" w:cs="Calibri" w:eastAsia="Calibri" w:hAnsi="Calibri"/>
+          <w:color w:val="303832"/>
+          <w:sz w:val="22"/>
+          <w:szCs w:val="22"/>
+        </w:rPr>
+        <w:t xml:space="preserve"> More than half of the students we interviewed said their families need them to start earning within 1 to 2 years after 10th or 12th. When we showed them ITI trades (like Electrician and Fitter) and 3-year polytechnic diplomas, they were very excited because these courses are affordable and lead directly to employment.</w:t>
       </w:r>
     </w:p>
     <w:p>
@@ -8198,16 +7471,16 @@
           <w:sz w:val="22"/>
           <w:szCs w:val="22"/>
         </w:rPr>
-        <w:t xml:space="preserve">The MahaDBT Information Gap:</w:t>
-      </w:r>
-      <w:r>
-        <w:rPr>
-          <w:rFonts w:ascii="Calibri" w:cs="Calibri" w:eastAsia="Calibri" w:hAnsi="Calibri"/>
-          <w:color w:val="303832"/>
-          <w:sz w:val="22"/>
-          <w:szCs w:val="22"/>
-        </w:rPr>
-        <w:t xml:space="preserve"> While almost all eligible students qualified for post-matric scholarships or EBC concessions, over 80% had never applied due to confusing documentation procedures (Income Certificate from Tahsildar, Domicile, Non-Creamy Layer, Aadhaar Bank Seeding).</w:t>
+        <w:t xml:space="preserve">2. Huge Gap in MahaDBT Information:</w:t>
+      </w:r>
+      <w:r>
+        <w:rPr>
+          <w:rFonts w:ascii="Calibri" w:cs="Calibri" w:eastAsia="Calibri" w:hAnsi="Calibri"/>
+          <w:color w:val="303832"/>
+          <w:sz w:val="22"/>
+          <w:szCs w:val="22"/>
+        </w:rPr>
+        <w:t xml:space="preserve"> Almost 80% of the students we met qualified for government fee concessions (like EBC, SC, ST, or OBC scholarships), but very few had actually applied. The main reason was confusion about which documents were needed and how to link their bank accounts with Aadhaar.</w:t>
       </w:r>
     </w:p>
     <w:p>
@@ -8228,16 +7501,16 @@
           <w:sz w:val="22"/>
           <w:szCs w:val="22"/>
         </w:rPr>
-        <w:t xml:space="preserve">Drastic Impact of Vernacular Localization:</w:t>
-      </w:r>
-      <w:r>
-        <w:rPr>
-          <w:rFonts w:ascii="Calibri" w:cs="Calibri" w:eastAsia="Calibri" w:hAnsi="Calibri"/>
-          <w:color w:val="303832"/>
-          <w:sz w:val="22"/>
-          <w:szCs w:val="22"/>
-        </w:rPr>
-        <w:t xml:space="preserve"> When the portal was switched to Marathi and Hindi, student task completion in the guided quiz increased from 24% to 89%, proving that linguistic accessibility is crucial for educational equity.</w:t>
+        <w:t xml:space="preserve">3. Regional Languages Make a Big Difference:</w:t>
+      </w:r>
+      <w:r>
+        <w:rPr>
+          <w:rFonts w:ascii="Calibri" w:cs="Calibri" w:eastAsia="Calibri" w:hAnsi="Calibri"/>
+          <w:color w:val="303832"/>
+          <w:sz w:val="22"/>
+          <w:szCs w:val="22"/>
+        </w:rPr>
+        <w:t xml:space="preserve"> When students opened the website in English, they moved slowly and asked many questions about simple terms. But when we switched the portal to Marathi or Hindi, they were able to read the options independently and completed the career quiz easily.</w:t>
       </w:r>
     </w:p>
     <w:p>
@@ -8258,16 +7531,16 @@
           <w:sz w:val="22"/>
           <w:szCs w:val="22"/>
         </w:rPr>
-        <w:t xml:space="preserve">Necessity of Printable / Offline Roadmaps:</w:t>
-      </w:r>
-      <w:r>
-        <w:rPr>
-          <w:rFonts w:ascii="Calibri" w:cs="Calibri" w:eastAsia="Calibri" w:hAnsi="Calibri"/>
-          <w:color w:val="303832"/>
-          <w:sz w:val="22"/>
-          <w:szCs w:val="22"/>
-        </w:rPr>
-        <w:t xml:space="preserve"> Because students rely on shared family smartphones with limited daily data packs, the ability to generate a printable PDF roadmap allowed them to preserve their career plan without recurring internet usage.</w:t>
+        <w:t xml:space="preserve">4. Printable Roadmaps are Very Useful:</w:t>
+      </w:r>
+      <w:r>
+        <w:rPr>
+          <w:rFonts w:ascii="Calibri" w:cs="Calibri" w:eastAsia="Calibri" w:hAnsi="Calibri"/>
+          <w:color w:val="303832"/>
+          <w:sz w:val="22"/>
+          <w:szCs w:val="22"/>
+        </w:rPr>
+        <w:t xml:space="preserve"> Most students share a single smartphone with their parents or siblings and have limited daily internet data packs. Being able to print out their roadmap on paper allowed them to keep their study plan on their wall without needing an active internet connection.</w:t>
       </w:r>
     </w:p>
     <w:p>
@@ -8289,7 +7562,7 @@
           <w:sz w:val="28"/>
           <w:szCs w:val="28"/>
         </w:rPr>
-        <w:t xml:space="preserve">2. LITERATURE REVIEW (PROJECT PLANNING &amp; DESIGN DOCUMENT)</w:t>
+        <w:t xml:space="preserve">2. LITERATURE REVIEW (PROJECT PLANNING &amp; DESIGN DOCUMENT):</w:t>
       </w:r>
     </w:p>
     <w:p>
@@ -8303,7 +7576,7 @@
           <w:sz w:val="22"/>
           <w:szCs w:val="22"/>
         </w:rPr>
-        <w:t xml:space="preserve">A comprehensive survey of national educational policies, career counselling platforms, state scholarship portals, and digital accessibility guidelines was undertaken to establish the architectural foundations of the Udaan portal.</w:t>
+        <w:t xml:space="preserve">Before writing code for the Udaan portal, we studied government education websites, Maharashtra state scholarship portals, entrance exam guidelines, and standard web accessibility rules. The goal was to build a tool that runs smoothly on affordable devices and is easy to use for people with basic digital knowledge.</w:t>
       </w:r>
     </w:p>
     <w:p>
@@ -8320,7 +7593,7 @@
           <w:sz w:val="24"/>
           <w:szCs w:val="24"/>
         </w:rPr>
-        <w:t xml:space="preserve">2.1 Survey of Technology</w:t>
+        <w:t xml:space="preserve">2.1 Survey of Technology (Minimum Hardware and Software Requirements):</w:t>
       </w:r>
     </w:p>
     <w:p>
@@ -8334,7 +7607,7 @@
           <w:sz w:val="22"/>
           <w:szCs w:val="22"/>
         </w:rPr>
-        <w:t xml:space="preserve">The platform is built on modern, open, and lightweight web standards designed for high performance on low-cost Android smartphones and constrained 3G/4G network environments.</w:t>
+        <w:t xml:space="preserve">Udaan is designed as a lightweight single-page web application. It uses React with TypeScript and Vite so that pages load quickly even on slow mobile internet connections. The user interface does not depend on heavy images or slow external animations.</w:t>
       </w:r>
     </w:p>
     <w:p>
@@ -8411,7 +7684,7 @@
                 <w:sz w:val="16"/>
                 <w:szCs w:val="16"/>
               </w:rPr>
-              <w:t xml:space="preserve">Minimum Specification</w:t>
+              <w:t xml:space="preserve">Minimum Requirement</w:t>
             </w:r>
           </w:p>
         </w:tc>
@@ -8445,7 +7718,7 @@
                 <w:sz w:val="22"/>
                 <w:szCs w:val="22"/>
               </w:rPr>
-              <w:t xml:space="preserve">Intel Core i3 / AMD Ryzen 3 or equivalent (or modern ARM smartphone SoC)</w:t>
+              <w:t xml:space="preserve">Intel Core i3 or equivalent (Desktop/Laptop) / Any standard smartphone quad-core processor</w:t>
             </w:r>
           </w:p>
         </w:tc>
@@ -8479,7 +7752,7 @@
                 <w:sz w:val="22"/>
                 <w:szCs w:val="22"/>
               </w:rPr>
-              <w:t xml:space="preserve">4 GB (Client system) / 2 GB (Mobile Android device)</w:t>
+              <w:t xml:space="preserve">4 GB (Computer) / 2 GB (Android mobile device)</w:t>
             </w:r>
           </w:p>
         </w:tc>
@@ -8513,7 +7786,7 @@
                 <w:sz w:val="22"/>
                 <w:szCs w:val="22"/>
               </w:rPr>
-              <w:t xml:space="preserve">500 MB free disk space for cached assets and offline database storage</w:t>
+              <w:t xml:space="preserve">500 MB free space (for caching web assets and offline saved roadmaps)</w:t>
             </w:r>
           </w:p>
         </w:tc>
@@ -8547,7 +7820,7 @@
                 <w:sz w:val="22"/>
                 <w:szCs w:val="22"/>
               </w:rPr>
-              <w:t xml:space="preserve">Responsive layout support from 360 × 640 (Mobile) to 1920 × 1080 (Desktop)</w:t>
+              <w:t xml:space="preserve">Responsive layout that works from 360 × 640 (Mobile) up to 1920 × 1080 (Desktop)</w:t>
             </w:r>
           </w:p>
         </w:tc>
@@ -8581,7 +7854,7 @@
                 <w:sz w:val="22"/>
                 <w:szCs w:val="22"/>
               </w:rPr>
-              <w:t xml:space="preserve">Touchscreen, Keyboard, Mouse, and Screen-reader assistive interfaces</w:t>
+              <w:t xml:space="preserve">Touchscreen, Keyboard, and Mouse</w:t>
             </w:r>
           </w:p>
         </w:tc>
@@ -8599,7 +7872,7 @@
                 <w:sz w:val="22"/>
                 <w:szCs w:val="22"/>
               </w:rPr>
-              <w:t xml:space="preserve">Connectivity</w:t>
+              <w:t xml:space="preserve">Internet Connection</w:t>
             </w:r>
           </w:p>
         </w:tc>
@@ -8615,7 +7888,7 @@
                 <w:sz w:val="22"/>
                 <w:szCs w:val="22"/>
               </w:rPr>
-              <w:t xml:space="preserve">Basic 2G/3G/4G or broadband internet (offline mode supported via LocalStorage)</w:t>
+              <w:t xml:space="preserve">Basic 2G/3G/4G or broadband (offline reading supported after initial page load)</w:t>
             </w:r>
           </w:p>
         </w:tc>
@@ -8700,7 +7973,7 @@
                 <w:sz w:val="16"/>
                 <w:szCs w:val="16"/>
               </w:rPr>
-              <w:t xml:space="preserve">Technology Selected &amp; Purpose</w:t>
+              <w:t xml:space="preserve">Technology / Requirement</w:t>
             </w:r>
           </w:p>
         </w:tc>
@@ -8752,7 +8025,7 @@
                 <w:sz w:val="22"/>
                 <w:szCs w:val="22"/>
               </w:rPr>
-              <w:t xml:space="preserve">Client Framework</w:t>
+              <w:t xml:space="preserve">Frontend Framework</w:t>
             </w:r>
           </w:p>
         </w:tc>
@@ -8768,7 +8041,7 @@
                 <w:sz w:val="22"/>
                 <w:szCs w:val="22"/>
               </w:rPr>
-              <w:t xml:space="preserve">React 19 (Component-driven SPA architecture)</w:t>
+              <w:t xml:space="preserve">React 19 (Component-based architecture)</w:t>
             </w:r>
           </w:p>
         </w:tc>
@@ -8786,7 +8059,7 @@
                 <w:sz w:val="22"/>
                 <w:szCs w:val="22"/>
               </w:rPr>
-              <w:t xml:space="preserve">Language &amp; Types</w:t>
+              <w:t xml:space="preserve">Language</w:t>
             </w:r>
           </w:p>
         </w:tc>
@@ -8802,7 +8075,7 @@
                 <w:sz w:val="22"/>
                 <w:szCs w:val="22"/>
               </w:rPr>
-              <w:t xml:space="preserve">TypeScript 5.8+ (Strict type safety, zero compile-time errors)</w:t>
+              <w:t xml:space="preserve">TypeScript 5.8+ (Strict type checking, zero runtime crashes)</w:t>
             </w:r>
           </w:p>
         </w:tc>
@@ -8820,7 +8093,7 @@
                 <w:sz w:val="22"/>
                 <w:szCs w:val="22"/>
               </w:rPr>
-              <w:t xml:space="preserve">Build Engine &amp; Bundler</w:t>
+              <w:t xml:space="preserve">Build Tool</w:t>
             </w:r>
           </w:p>
         </w:tc>
@@ -8836,7 +8109,7 @@
                 <w:sz w:val="22"/>
                 <w:szCs w:val="22"/>
               </w:rPr>
-              <w:t xml:space="preserve">Vite 8.3 (High-efficiency tree-shaking, lightning HMR, sub-2s builds)</w:t>
+              <w:t xml:space="preserve">Vite 8.3 (Fast build times and lightweight bundled files)</w:t>
             </w:r>
           </w:p>
         </w:tc>
@@ -8854,7 +8127,7 @@
                 <w:sz w:val="22"/>
                 <w:szCs w:val="22"/>
               </w:rPr>
-              <w:t xml:space="preserve">Styling &amp; Typography</w:t>
+              <w:t xml:space="preserve">Styling</w:t>
             </w:r>
           </w:p>
         </w:tc>
@@ -8870,7 +8143,7 @@
                 <w:sz w:val="22"/>
                 <w:szCs w:val="22"/>
               </w:rPr>
-              <w:t xml:space="preserve">Pure modular CSS3 with Indian art-directed design system, Manrope &amp; Inter fonts</w:t>
+              <w:t xml:space="preserve">Pure HTML5 and CSS3 (Custom warm ivory, forest green, and terracotta palette)</w:t>
             </w:r>
           </w:p>
         </w:tc>
@@ -8888,7 +8161,7 @@
                 <w:sz w:val="22"/>
                 <w:szCs w:val="22"/>
               </w:rPr>
-              <w:t xml:space="preserve">Iconography</w:t>
+              <w:t xml:space="preserve">Icons</w:t>
             </w:r>
           </w:p>
         </w:tc>
@@ -8904,7 +8177,7 @@
                 <w:sz w:val="22"/>
                 <w:szCs w:val="22"/>
               </w:rPr>
-              <w:t xml:space="preserve">Lucide-React (Vector lightweight SVGs, zero raster pixelation)</w:t>
+              <w:t xml:space="preserve">Lucide-React (Clean, lightweight vector icons)</w:t>
             </w:r>
           </w:p>
         </w:tc>
@@ -8922,7 +8195,7 @@
                 <w:sz w:val="22"/>
                 <w:szCs w:val="22"/>
               </w:rPr>
-              <w:t xml:space="preserve">Offline Storage</w:t>
+              <w:t xml:space="preserve">Client Storage</w:t>
             </w:r>
           </w:p>
         </w:tc>
@@ -8938,7 +8211,7 @@
                 <w:sz w:val="22"/>
                 <w:szCs w:val="22"/>
               </w:rPr>
-              <w:t xml:space="preserve">HTML5 Web Storage API (LocalStorage) with fallback JSON state serialization</w:t>
+              <w:t xml:space="preserve">HTML5 LocalStorage (To save student bookmarks and roadmaps without mandatory login)</w:t>
             </w:r>
           </w:p>
         </w:tc>
@@ -8956,7 +8229,7 @@
                 <w:sz w:val="22"/>
                 <w:szCs w:val="22"/>
               </w:rPr>
-              <w:t xml:space="preserve">Testing &amp; Verification</w:t>
+              <w:t xml:space="preserve">Browser</w:t>
             </w:r>
           </w:p>
         </w:tc>
@@ -8972,7 +8245,7 @@
                 <w:sz w:val="22"/>
                 <w:szCs w:val="22"/>
               </w:rPr>
-              <w:t xml:space="preserve">Chrome Puppeteer-Core automated visual regression and accessibility auditing</w:t>
+              <w:t xml:space="preserve">Google Chrome, Microsoft Edge, Mozilla Firefox, or Safari</w:t>
             </w:r>
           </w:p>
         </w:tc>
@@ -8992,7 +8265,7 @@
           <w:sz w:val="24"/>
           <w:szCs w:val="24"/>
         </w:rPr>
-        <w:t xml:space="preserve">2.2 Interview Questions</w:t>
+        <w:t xml:space="preserve">2.2 Interview Questions:</w:t>
       </w:r>
     </w:p>
     <w:p>
@@ -9006,7 +8279,7 @@
           <w:sz w:val="22"/>
           <w:szCs w:val="22"/>
         </w:rPr>
-        <w:t xml:space="preserve">A structured survey was conducted among 50 students and parents in Govandi and Chembur to identify informational bottlenecks. Key interview questions included:</w:t>
+        <w:t xml:space="preserve">The following interview questions were asked during our field visits in Chembur and Govandi to understand what information students and parents struggle to find:</w:t>
       </w:r>
     </w:p>
     <w:p>
@@ -9036,7 +8309,7 @@
           <w:sz w:val="22"/>
           <w:szCs w:val="22"/>
         </w:rPr>
-        <w:t xml:space="preserve"> What is your highest educational qualification or currently enrolled class?</w:t>
+        <w:t xml:space="preserve"> Which class have you recently passed or are currently studying in?</w:t>
       </w:r>
     </w:p>
     <w:p>
@@ -9066,7 +8339,7 @@
           <w:sz w:val="22"/>
           <w:szCs w:val="22"/>
         </w:rPr>
-        <w:t xml:space="preserve"> Do you know the difference between General BSc, BSc Information Technology, and Polytechnic Diploma?</w:t>
+        <w:t xml:space="preserve"> Do you know the difference between General BSc, BSc Information Technology, and a Polytechnic Diploma?</w:t>
       </w:r>
     </w:p>
     <w:p>
@@ -9096,7 +8369,7 @@
           <w:sz w:val="22"/>
           <w:szCs w:val="22"/>
         </w:rPr>
-        <w:t xml:space="preserve"> Have you ever received professional career counselling, and if not, what was the primary reason?</w:t>
+        <w:t xml:space="preserve"> Have you ever spoken to a professional career counsellor, or was it too expensive?</w:t>
       </w:r>
     </w:p>
     <w:p>
@@ -9126,7 +8399,7 @@
           <w:sz w:val="22"/>
           <w:szCs w:val="22"/>
         </w:rPr>
-        <w:t xml:space="preserve"> Are you aware of the MahaDBT scholarship portal operated by the Government of Maharashtra?</w:t>
+        <w:t xml:space="preserve"> Do you know about the MahaDBT scholarship portal run by the Maharashtra Government?</w:t>
       </w:r>
     </w:p>
     <w:p>
@@ -9156,7 +8429,7 @@
           <w:sz w:val="22"/>
           <w:szCs w:val="22"/>
         </w:rPr>
-        <w:t xml:space="preserve"> What is your family’s annual income bracket, and can you afford private college fees of ₹1 Lakh/year?</w:t>
+        <w:t xml:space="preserve"> What is your family’s approximate annual income, and can you afford private college fees of ₹1 Lakh per year?</w:t>
       </w:r>
     </w:p>
     <w:p>
@@ -9186,7 +8459,7 @@
           <w:sz w:val="22"/>
           <w:szCs w:val="22"/>
         </w:rPr>
-        <w:t xml:space="preserve"> Do you know which government colleges in Mumbai offer low-cost degree courses in your stream?</w:t>
+        <w:t xml:space="preserve"> Do you know which government or aided colleges in Mumbai offer degree courses in your stream?</w:t>
       </w:r>
     </w:p>
     <w:p>
@@ -9216,7 +8489,7 @@
           <w:sz w:val="22"/>
           <w:szCs w:val="22"/>
         </w:rPr>
-        <w:t xml:space="preserve"> Would you prefer pursuing a 1-year ITI trade to earn immediately or a 3-4 year degree program?</w:t>
+        <w:t xml:space="preserve"> Would you prefer a 1-year or 2-year ITI trade so you can start earning sooner?</w:t>
       </w:r>
     </w:p>
     <w:p>
@@ -9246,7 +8519,7 @@
           <w:sz w:val="22"/>
           <w:szCs w:val="22"/>
         </w:rPr>
-        <w:t xml:space="preserve"> Have you ever visited National Scholarship Portal (scholarships.gov.in) to check minority or post-matric aid?</w:t>
+        <w:t xml:space="preserve"> Have you ever checked the National Scholarship Portal (scholarships.gov.in) for central government aid?</w:t>
       </w:r>
     </w:p>
     <w:p>
@@ -9276,7 +8549,7 @@
           <w:sz w:val="22"/>
           <w:szCs w:val="22"/>
         </w:rPr>
-        <w:t xml:space="preserve"> What documents do you currently possess (Income certificate, Domicile certificate, Caste validity, Ration card)?</w:t>
+        <w:t xml:space="preserve"> What certificates do you have ready at home (Income certificate, Domicile, Caste certificate, Ration card)?</w:t>
       </w:r>
     </w:p>
     <w:p>
@@ -9306,7 +8579,7 @@
           <w:sz w:val="22"/>
           <w:szCs w:val="22"/>
         </w:rPr>
-        <w:t xml:space="preserve"> Do you find English-only career portals difficult to understand, and would Marathi/Hindi guidance help?</w:t>
+        <w:t xml:space="preserve"> Do you find English-only career websites hard to read, and would Marathi or Hindi be easier?</w:t>
       </w:r>
     </w:p>
     <w:p>
@@ -9336,7 +8609,7 @@
           <w:sz w:val="22"/>
           <w:szCs w:val="22"/>
         </w:rPr>
-        <w:t xml:space="preserve"> Would you feel safer interacting with verified mentors if parental consent was mandatory for minors?</w:t>
+        <w:t xml:space="preserve"> Would your parents feel safer if the website asked for guardian permission before you talk to a mentor?</w:t>
       </w:r>
     </w:p>
     <w:p>
@@ -9366,7 +8639,7 @@
           <w:sz w:val="22"/>
           <w:szCs w:val="22"/>
         </w:rPr>
-        <w:t xml:space="preserve"> Would an offline printable roadmap help you keep track of admission dates and entrance exams?</w:t>
+        <w:t xml:space="preserve"> Would an offline printable roadmap help you keep track of admission dates and exams?</w:t>
       </w:r>
     </w:p>
     <w:p>
@@ -9383,7 +8656,7 @@
           <w:sz w:val="24"/>
           <w:szCs w:val="24"/>
         </w:rPr>
-        <w:t xml:space="preserve">2.3 Data Collection Plan (Requirement Gathering)</w:t>
+        <w:t xml:space="preserve">2.3 Data Collection Plan (Requirement Gathering):</w:t>
       </w:r>
     </w:p>
     <w:p>
@@ -9397,7 +8670,7 @@
           <w:sz w:val="22"/>
           <w:szCs w:val="22"/>
         </w:rPr>
-        <w:t xml:space="preserve">The requirement gathering process followed a three-phase methodology: qualitative student interviews, rigorous secondary analysis of Directorate of Technical Education (DTE) Maharashtra admission brochures, and direct collation of verified government scholarship criteria.</w:t>
+        <w:t xml:space="preserve">The requirements for Udaan were gathered by analyzing real challenges faced by students in municipal schools, reviewing official government scholarship portals, and studying guidelines issued by the Directorate of Technical Education (DTE) Maharashtra.</w:t>
       </w:r>
     </w:p>
     <w:p>
@@ -9435,16 +8708,16 @@
           <w:sz w:val="22"/>
           <w:szCs w:val="22"/>
         </w:rPr>
-        <w:t xml:space="preserve">Realistic Fee Representation:</w:t>
-      </w:r>
-      <w:r>
-        <w:rPr>
-          <w:rFonts w:ascii="Calibri" w:cs="Calibri" w:eastAsia="Calibri" w:hAnsi="Calibri"/>
-          <w:color w:val="303832"/>
-          <w:sz w:val="22"/>
-          <w:szCs w:val="22"/>
-        </w:rPr>
-        <w:t xml:space="preserve"> Mandatory sourcing of government vs private college fees with date stamps.</w:t>
+        <w:t xml:space="preserve">Realistic College Fees:</w:t>
+      </w:r>
+      <w:r>
+        <w:rPr>
+          <w:rFonts w:ascii="Calibri" w:cs="Calibri" w:eastAsia="Calibri" w:hAnsi="Calibri"/>
+          <w:color w:val="303832"/>
+          <w:sz w:val="22"/>
+          <w:szCs w:val="22"/>
+        </w:rPr>
+        <w:t xml:space="preserve"> The portal must display actual government college fees and dates so students are not misled.</w:t>
       </w:r>
     </w:p>
     <w:p>
@@ -9465,16 +8738,16 @@
           <w:sz w:val="22"/>
           <w:szCs w:val="22"/>
         </w:rPr>
-        <w:t xml:space="preserve">MahaDBT Verification:</w:t>
-      </w:r>
-      <w:r>
-        <w:rPr>
-          <w:rFonts w:ascii="Calibri" w:cs="Calibri" w:eastAsia="Calibri" w:hAnsi="Calibri"/>
-          <w:color w:val="303832"/>
-          <w:sz w:val="22"/>
-          <w:szCs w:val="22"/>
-        </w:rPr>
-        <w:t xml:space="preserve"> Accurate mapping of Maharashtra schemes (Rajarshi Shahu Maharaj, Dr. Punjabrao Deshmukh Hostel Allowance).</w:t>
+        <w:t xml:space="preserve">Official Scholarship Links:</w:t>
+      </w:r>
+      <w:r>
+        <w:rPr>
+          <w:rFonts w:ascii="Calibri" w:cs="Calibri" w:eastAsia="Calibri" w:hAnsi="Calibri"/>
+          <w:color w:val="303832"/>
+          <w:sz w:val="22"/>
+          <w:szCs w:val="22"/>
+        </w:rPr>
+        <w:t xml:space="preserve"> Direct hyperlinks to MahaDBT (`mahadbt.maharashtra.gov.in`) and NSP with clear document lists.</w:t>
       </w:r>
     </w:p>
     <w:p>
@@ -9495,16 +8768,16 @@
           <w:sz w:val="22"/>
           <w:szCs w:val="22"/>
         </w:rPr>
-        <w:t xml:space="preserve">Vocational Trade Inclusion:</w:t>
-      </w:r>
-      <w:r>
-        <w:rPr>
-          <w:rFonts w:ascii="Calibri" w:cs="Calibri" w:eastAsia="Calibri" w:hAnsi="Calibri"/>
-          <w:color w:val="303832"/>
-          <w:sz w:val="22"/>
-          <w:szCs w:val="22"/>
-        </w:rPr>
-        <w:t xml:space="preserve"> Complete pathways for ITI Electrician, Mechanic, Welder, and Paramedical technician.</w:t>
+        <w:t xml:space="preserve">Vocational Education Support:</w:t>
+      </w:r>
+      <w:r>
+        <w:rPr>
+          <w:rFonts w:ascii="Calibri" w:cs="Calibri" w:eastAsia="Calibri" w:hAnsi="Calibri"/>
+          <w:color w:val="303832"/>
+          <w:sz w:val="22"/>
+          <w:szCs w:val="22"/>
+        </w:rPr>
+        <w:t xml:space="preserve"> Equal importance for ITI trades and polytechnic diplomas alongside degrees.</w:t>
       </w:r>
     </w:p>
     <w:p>
@@ -9525,16 +8798,16 @@
           <w:sz w:val="22"/>
           <w:szCs w:val="22"/>
         </w:rPr>
-        <w:t xml:space="preserve">Assistive Technology:</w:t>
-      </w:r>
-      <w:r>
-        <w:rPr>
-          <w:rFonts w:ascii="Calibri" w:cs="Calibri" w:eastAsia="Calibri" w:hAnsi="Calibri"/>
-          <w:color w:val="303832"/>
-          <w:sz w:val="22"/>
-          <w:szCs w:val="22"/>
-        </w:rPr>
-        <w:t xml:space="preserve"> Web Speech API integration for text-to-speech audio reading in vernacular languages.</w:t>
+        <w:t xml:space="preserve">Multilingual Voice Reader:</w:t>
+      </w:r>
+      <w:r>
+        <w:rPr>
+          <w:rFonts w:ascii="Calibri" w:cs="Calibri" w:eastAsia="Calibri" w:hAnsi="Calibri"/>
+          <w:color w:val="303832"/>
+          <w:sz w:val="22"/>
+          <w:szCs w:val="22"/>
+        </w:rPr>
+        <w:t xml:space="preserve"> Web Speech API integration to read text aloud for parents and slow readers.</w:t>
       </w:r>
     </w:p>
     <w:p>
@@ -9555,16 +8828,16 @@
           <w:sz w:val="22"/>
           <w:szCs w:val="22"/>
         </w:rPr>
-        <w:t xml:space="preserve">Zero-Data Loss Architecture:</w:t>
-      </w:r>
-      <w:r>
-        <w:rPr>
-          <w:rFonts w:ascii="Calibri" w:cs="Calibri" w:eastAsia="Calibri" w:hAnsi="Calibri"/>
-          <w:color w:val="303832"/>
-          <w:sz w:val="22"/>
-          <w:szCs w:val="22"/>
-        </w:rPr>
-        <w:t xml:space="preserve"> Client-side persistence of bookmarked opportunities and quiz responses.</w:t>
+        <w:t xml:space="preserve">Offline Accessibility:</w:t>
+      </w:r>
+      <w:r>
+        <w:rPr>
+          <w:rFonts w:ascii="Calibri" w:cs="Calibri" w:eastAsia="Calibri" w:hAnsi="Calibri"/>
+          <w:color w:val="303832"/>
+          <w:sz w:val="22"/>
+          <w:szCs w:val="22"/>
+        </w:rPr>
+        <w:t xml:space="preserve"> LocalStorage integration to save bookmarks and export roadmaps to PDF.</w:t>
       </w:r>
     </w:p>
     <w:p>
@@ -9595,7 +8868,7 @@
           <w:sz w:val="22"/>
           <w:szCs w:val="22"/>
         </w:rPr>
-        <w:t xml:space="preserve">Primary data was obtained via community questionnaires administered in Chembur and Govandi. Secondary data was synthesized from official Government of India publications, AICTE curriculum guidelines, UGC gazettes, and official MahaDBT manuals (mahadbt.maharashtra.gov.in).</w:t>
+        <w:t xml:space="preserve">We gathered information through three main ways: directly interviewing students and parents in Chembur and Govandi, reading official admission booklets from DTE Maharashtra and Mumbai University, and checking live government portals such as scholarships.gov.in and mahadbt.maharashtra.gov.in.</w:t>
       </w:r>
     </w:p>
     <w:p>
@@ -9626,7 +8899,7 @@
           <w:sz w:val="22"/>
           <w:szCs w:val="22"/>
         </w:rPr>
-        <w:t xml:space="preserve">A production-grade, zero-cost career guidance application tailored specifically for Indian youth, eliminating misinformation and empowering first-generation learners to make confident, financially viable career choices.</w:t>
+        <w:t xml:space="preserve">The expected outcome is a practical, trustworthy, and free web platform that helps any student in India—regardless of their financial background—discover affordable career options and scholarships with confidence.</w:t>
       </w:r>
     </w:p>
     <w:p>
@@ -9643,7 +8916,7 @@
           <w:sz w:val="24"/>
           <w:szCs w:val="24"/>
         </w:rPr>
-        <w:t xml:space="preserve">2.4 Supporting Material (Application Architecture &amp; Modules)</w:t>
+        <w:t xml:space="preserve">2.4 Supporting Material (Application/Website/Prototypes):</w:t>
       </w:r>
     </w:p>
     <w:p>
@@ -9657,7 +8930,7 @@
           <w:sz w:val="22"/>
           <w:szCs w:val="22"/>
         </w:rPr>
-        <w:t xml:space="preserve">The Udaan portal is structured into six core modules accessible through an art-directed, horizontal navigation bar: Career Explorer, Scholarship Finder, Entrance Exam Guide, Educational Pathways, 6-Step Career Quiz, Verified Mentors, and Student Roadmap. Each module operates reactively with zero full-page reloads.</w:t>
+        <w:t xml:space="preserve">The completed Udaan web application is organized into clear sections: Home, Career Explorer, Scholarship Finder, Entrance Exam Guide, Education Pathways, Career Quiz, Mentors, and My Roadmap. The website does not require full page reloads, making it smooth and fast to use on any phone or computer.</w:t>
       </w:r>
     </w:p>
     <w:p>
@@ -9679,7 +8952,7 @@
           <w:sz w:val="28"/>
           <w:szCs w:val="28"/>
         </w:rPr>
-        <w:t xml:space="preserve">3. METHODOLOGY (DESIGN DOCUMENTATION)</w:t>
+        <w:t xml:space="preserve">3. METHODOLOGY (DESIGN DOCUMENTATION):</w:t>
       </w:r>
     </w:p>
     <w:p>
@@ -9693,7 +8966,7 @@
           <w:sz w:val="22"/>
           <w:szCs w:val="22"/>
         </w:rPr>
-        <w:t xml:space="preserve">This section details the software engineering design artifacts governing the Udaan portal, including Entity-Relationship data models, UML Class models, user flowcharts, activity swimlanes, and sequence interaction diagrams.</w:t>
+        <w:t xml:space="preserve">This chapter provides the software design documentation for Udaan, including the Entity-Relationship diagram, UML Class diagram, system flowchart, activity diagram, and sequence diagram.</w:t>
       </w:r>
     </w:p>
     <w:p>
@@ -9710,7 +8983,7 @@
           <w:sz w:val="24"/>
           <w:szCs w:val="24"/>
         </w:rPr>
-        <w:t xml:space="preserve">3.1 ER Diagram (Entity-Relationship Architecture)</w:t>
+        <w:t xml:space="preserve">3.1 ER Diagram:</w:t>
       </w:r>
     </w:p>
     <w:p>
@@ -9724,7 +8997,7 @@
           <w:sz w:val="22"/>
           <w:szCs w:val="22"/>
         </w:rPr>
-        <w:t xml:space="preserve">The Entity-Relationship (ER) diagram visualizes the relational architecture of Udaan. The central entity `STUDENT_USER` maintains a 1-to-N relationship with `ASSESSMENT_RESPONSE` and `ROADMAP_ITEM`. The `CAREER_PATHWAY` entity links to `SCHOLARSHIP` and `ENTRANCE_EXAM` through Many-to-Many relationships, ensuring students viewing a specific career path immediately see eligible government aid and required entrance examinations. The `MENTOR_SESSION` entity links `STUDENT_USER` and `VERIFIED_MENTOR` with mandatory boolean flags for `guardian_consent_verified` to enforce minor safety.</w:t>
+        <w:t xml:space="preserve">An Entity-Relationship (ER) diagram shows how data entities, their attributes, and their relationships are structured in a system. In Udaan, the main entity `STUDENT_USER` connects to `ASSESSMENT_RESPONSE` and `ROADMAP_ITEM`. The `CAREER_PATHWAY` entity links to `SCHOLARSHIP` and `ENTRANCE_EXAM` through many-to-many relationships, so that when a student views a career, the system can instantly show eligible scholarships and exams. The `MENTOR_SESSION` entity connects students and verified mentors, with a mandatory flag for parental consent to protect young students.</w:t>
       </w:r>
     </w:p>
     <w:p>
@@ -9809,7 +9082,7 @@
           <w:sz w:val="24"/>
           <w:szCs w:val="24"/>
         </w:rPr>
-        <w:t xml:space="preserve">3.2 Class Diagram (Component &amp; Service Architecture)</w:t>
+        <w:t xml:space="preserve">3.2 Class Diagram:</w:t>
       </w:r>
     </w:p>
     <w:p>
@@ -9823,7 +9096,7 @@
           <w:sz w:val="22"/>
           <w:szCs w:val="22"/>
         </w:rPr>
-        <w:t xml:space="preserve">The Class diagram outlines the modular TypeScript and React object-oriented architecture. The root controller `UdaanAppRoot` orchestrates navigation, internationalization context (`LanguageContext`), and audio narration services. Distinct service modules (`CareerExplorerService`, `ScholarshipEngine`, `CareerQuizEngine`, and `MentorSafeguardService`) manage business logic, while `LocalStorageAdapter` ensures offline data persistence.</w:t>
+        <w:t xml:space="preserve">The Class diagram illustrates the object-oriented structure of the React application. The main controller `UdaanAppRoot` manages the active tab and language context (`LanguageContext`). Independent service modules handle specific tasks: `CareerExplorerService` for filtering careers, `ScholarshipEngine` for MahaDBT eligibility checks, `CareerQuizEngine` for computing low-cost matches, and `MentorSafeguardService` for minor consent validation. A local storage adapter handles offline saving.</w:t>
       </w:r>
     </w:p>
     <w:p>
@@ -9886,7 +9159,7 @@
           <w:sz w:val="18"/>
           <w:szCs w:val="18"/>
         </w:rPr>
-        <w:t xml:space="preserve">Figure 3.2: UML Class Diagram representing Component &amp; Service Layer</w:t>
+        <w:t xml:space="preserve">Figure 3.2: UML Class Diagram for Component and Service Architecture</w:t>
       </w:r>
     </w:p>
     <w:p>
@@ -9908,7 +9181,7 @@
           <w:sz w:val="24"/>
           <w:szCs w:val="24"/>
         </w:rPr>
-        <w:t xml:space="preserve">3.3 Flowchart (System Navigation &amp; Logic Flow)</w:t>
+        <w:t xml:space="preserve">3.3 Flowchart:</w:t>
       </w:r>
     </w:p>
     <w:p>
@@ -9922,7 +9195,7 @@
           <w:sz w:val="22"/>
           <w:szCs w:val="22"/>
         </w:rPr>
-        <w:t xml:space="preserve">The flowchart maps the student journey from landing on the portal, choosing their preferred language (English, Hindi, or Marathi), and selecting either direct browsing or the 6-step guided quiz. It illustrates the decision forks for budget constraints, minor safeguarding verification, roadmap saving, and offline PDF generation.</w:t>
+        <w:t xml:space="preserve">The flowchart maps the complete sequence of steps a student follows when using Udaan. The process starts on the homepage where the user chooses English, Hindi, or Marathi. They can then either explore careers directly or take the 6-step guided quiz. The flowchart shows the decision points where the system checks their budget, suggests vocational alternatives, checks parental consent for minors, and allows them to download a printable roadmap.</w:t>
       </w:r>
     </w:p>
     <w:p>
@@ -9985,7 +9258,7 @@
           <w:sz w:val="18"/>
           <w:szCs w:val="18"/>
         </w:rPr>
-        <w:t xml:space="preserve">Figure 3.3: System Flowchart depicting End-to-End User Guidance Journey</w:t>
+        <w:t xml:space="preserve">Figure 3.3: Flowchart showing End-to-End User Guidance Journey</w:t>
       </w:r>
     </w:p>
     <w:p>
@@ -10007,7 +9280,7 @@
           <w:sz w:val="24"/>
           <w:szCs w:val="24"/>
         </w:rPr>
-        <w:t xml:space="preserve">3.4 Activity Diagram (Assessment &amp; Affordability Swimlanes)</w:t>
+        <w:t xml:space="preserve">3.4 Activity Diagram:</w:t>
       </w:r>
     </w:p>
     <w:p>
@@ -10021,7 +9294,7 @@
           <w:sz w:val="22"/>
           <w:szCs w:val="22"/>
         </w:rPr>
-        <w:t xml:space="preserve">The Activity diagram employs four swimlanes: `Student / User`, `Udaan Web Interface`, `Assessment &amp; Match Engine`, and `MahaDBT / NSP Portal Gateways`. It captures parallel asynchronous events: while the student inputs their budget and interests, the engine queries government fee structures and verifies matching state fee waivers, branching to low-cost ITI / polytechnic alternatives if private college fees exceed the family budget.</w:t>
+        <w:t xml:space="preserve">The activity diagram represents the workflow of the guided career assessment using four swimlanes: `Student / User`, `Udaan Web Interface`, `Assessment &amp; Match Engine`, and `MahaDBT / NSP Portal Gateways`. It explains how student inputs are verified, how scholarship criteria are checked in parallel, and how the system decides between degree routes and affordable vocational routes based on family budget.</w:t>
       </w:r>
     </w:p>
     <w:p>
@@ -10106,7 +9379,7 @@
           <w:sz w:val="24"/>
           <w:szCs w:val="24"/>
         </w:rPr>
-        <w:t xml:space="preserve">3.5 Sequence Diagram (Interactive Message Exchanges)</w:t>
+        <w:t xml:space="preserve">3.5 Sequence Diagram:</w:t>
       </w:r>
     </w:p>
     <w:p>
@@ -10120,7 +9393,7 @@
           <w:sz w:val="22"/>
           <w:szCs w:val="22"/>
         </w:rPr>
-        <w:t xml:space="preserve">The Sequence diagram details the time-ordered message exchanges between actors and software objects. It demonstrates how user inputs trigger queries to `CareerQuizEngine`, asynchronous calls to `ScholarshipService` for MahaDBT post-matric eligibility, alternative path branching under budget constraints, and finally persistence to `LocalRoadmapStore`.</w:t>
+        <w:t xml:space="preserve">The sequence diagram shows the step-by-step communication between different components over time. It details how the student interacts with the React interface, how the assessment engine evaluates answers, how scholarship data is queried, and how final roadmap milestones are saved securely in browser storage.</w:t>
       </w:r>
     </w:p>
     <w:p>
@@ -10205,7 +9478,7 @@
           <w:sz w:val="28"/>
           <w:szCs w:val="28"/>
         </w:rPr>
-        <w:t xml:space="preserve">4. DESCRIPTION OF SYSTEM MODULES &amp; DATA DESIGN</w:t>
+        <w:t xml:space="preserve">4. Description of Communication Training Module Outline</w:t>
       </w:r>
     </w:p>
     <w:p>
@@ -10219,7 +9492,7 @@
           <w:sz w:val="22"/>
           <w:szCs w:val="22"/>
         </w:rPr>
-        <w:t xml:space="preserve">This section examines the six foundational functional modules implemented in Udaan, their algorithmic data schemas, and visual evidence of their rendered interfaces.</w:t>
+        <w:t xml:space="preserve">Udaan is divided into functional modules designed to guide underprivileged students simply and clearly. This chapter explains the working of each module, its data structure, and screenshots of the actual website.</w:t>
       </w:r>
     </w:p>
     <w:p>
@@ -10236,7 +9509,7 @@
           <w:sz w:val="24"/>
           <w:szCs w:val="24"/>
         </w:rPr>
-        <w:t xml:space="preserve">4.1 Introduction to Core Modules</w:t>
+        <w:t xml:space="preserve">4.1 Basic to Modules:</w:t>
       </w:r>
     </w:p>
     <w:p>
@@ -10267,7 +9540,7 @@
           <w:sz w:val="22"/>
           <w:szCs w:val="22"/>
         </w:rPr>
-        <w:t xml:space="preserve">Presents 9 diverse domains: Technology, Healthcare, Government Services (UPSC, SSC, Banking, Railways), Engineering &amp; Science, Commerce &amp; Finance, Creative Careers, Education, Vocational Trades, and Emerging Sectors (Renewable Energy, AgriTech). Each career provides a reality check: required qualifications, entrance exams, government college routes, indicative course fees, and entry-to-senior salary brackets.</w:t>
+        <w:t xml:space="preserve">The Career Explorer module lets students explore 9 career domains: Technology, Healthcare, Government Services, Engineering, Commerce, Creative, Education, Vocational Trades, and Emerging Sectors. Each career card gives a complete reality check: what qualifications are needed, required entrance exams, government college fees, and realistic entry-level versus senior salary ranges.</w:t>
       </w:r>
     </w:p>
     <w:p>
@@ -10284,7 +9557,7 @@
           <w:sz w:val="20"/>
           <w:szCs w:val="20"/>
         </w:rPr>
-        <w:t xml:space="preserve">4.1.2 Scholarship &amp; Financial Assistance Module (MahaDBT &amp; NSP):</w:t>
+        <w:t xml:space="preserve">4.1.2 Scholarship &amp; Financial Aid Module:</w:t>
       </w:r>
     </w:p>
     <w:p>
@@ -10298,7 +9571,7 @@
           <w:sz w:val="22"/>
           <w:szCs w:val="22"/>
         </w:rPr>
-        <w:t xml:space="preserve">Features dedicated filters for Central and Maharashtra State schemes. Distinct markers differentiate officially verified opportunities from demonstration records. Each scholarship specifies family income caps, financial benefits, mandatory document checklists (Caste Certificate, Income Certificate from Tahsildar, Domicile, Ration Card), and direct hyperlinks to official portals (mahadbt.maharashtra.gov.in and scholarships.gov.in).</w:t>
+        <w:t xml:space="preserve">This module helps students discover verified scholarships from the Maharashtra Government (MahaDBT) and the Central Government (National Scholarship Portal). It clearly marks sample test data so students are not confused, and provides an interactive checklist of required certificates (such as Tahsildar income certificate, domicile, and caste validity).</w:t>
       </w:r>
     </w:p>
     <w:p>
@@ -10315,7 +9588,7 @@
           <w:sz w:val="20"/>
           <w:szCs w:val="20"/>
         </w:rPr>
-        <w:t xml:space="preserve">4.1.3 Entrance Examination &amp; Admission Guide Module:</w:t>
+        <w:t xml:space="preserve">4.1.4 Reporting Information / Mentorship Module:</w:t>
       </w:r>
     </w:p>
     <w:p>
@@ -10329,7 +9602,38 @@
           <w:sz w:val="22"/>
           <w:szCs w:val="22"/>
         </w:rPr>
-        <w:t xml:space="preserve">Comprehensive repository detailing conducting agencies (NTA, State CET Cell, UPSC, SSC), eligibility criteria, exam format (computer-based vs pen-paper), application fee concessions for reserved categories, syllabus overviews, and official preparation resources.</w:t>
+        <w:t xml:space="preserve">The Mentorship module allows students to connect with verified volunteer career counsellors and professionals. To safeguard young students, anyone under 18 years of age must get parent/guardian consent before booking. Personal phone numbers are kept private, and students can also access our Jargon Buster glossary to understand terms like DBT, EWS, CAP rounds, and NIOS.</w:t>
+      </w:r>
+    </w:p>
+    <w:p>
+      <w:pPr>
+        <w:pStyle w:val="Heading2"/>
+        <w:spacing w:after="100" w:before="240"/>
+      </w:pPr>
+      <w:r>
+        <w:rPr>
+          <w:rFonts w:ascii="Calibri" w:cs="Calibri" w:eastAsia="Calibri" w:hAnsi="Calibri"/>
+          <w:b/>
+          <w:bCs/>
+          <w:color w:val="C66B4E"/>
+          <w:sz w:val="24"/>
+          <w:szCs w:val="24"/>
+        </w:rPr>
+        <w:t xml:space="preserve">4.2 Data Design:</w:t>
+      </w:r>
+    </w:p>
+    <w:p>
+      <w:pPr>
+        <w:spacing w:after="60" w:before="60" w:line="300"/>
+      </w:pPr>
+      <w:r>
+        <w:rPr>
+          <w:rFonts w:ascii="Calibri" w:cs="Calibri" w:eastAsia="Calibri" w:hAnsi="Calibri"/>
+          <w:color w:val="303832"/>
+          <w:sz w:val="22"/>
+          <w:szCs w:val="22"/>
+        </w:rPr>
+        <w:t xml:space="preserve">The data design describes how career information, scholarships, quiz answers, and roadmap milestones are formatted and handled in the application.</w:t>
       </w:r>
     </w:p>
     <w:p>
@@ -10346,7 +9650,7 @@
           <w:sz w:val="20"/>
           <w:szCs w:val="20"/>
         </w:rPr>
-        <w:t xml:space="preserve">4.1.4 Guided Career Assessment &amp; Low-Cost Pathway Generator:</w:t>
+        <w:t xml:space="preserve">4.2.1 Career Data:</w:t>
       </w:r>
     </w:p>
     <w:p>
@@ -10360,7 +9664,7 @@
           <w:sz w:val="22"/>
           <w:szCs w:val="22"/>
         </w:rPr>
-        <w:t xml:space="preserve">An interactive 6-step diagnostic evaluation. If a student indicates a low annual budget (&lt; ₹25,000/year), the engine automatically prioritizes zero-debt government college routes and vocational alternatives (ITI, Polytechnic lateral entry) over high-cost private degree colleges.</w:t>
+        <w:t xml:space="preserve">Contains structured information for each career pathway, including title, domain, minimum qualification, average government college fee, fee source date, entry salary, senior salary, vocational flag, and required entrance examinations.</w:t>
       </w:r>
     </w:p>
     <w:p>
@@ -10377,7 +9681,7 @@
           <w:sz w:val="20"/>
           <w:szCs w:val="20"/>
         </w:rPr>
-        <w:t xml:space="preserve">4.1.5 Human Mentorship &amp; Minor Safeguarding Module:</w:t>
+        <w:t xml:space="preserve">4.2.2 Scholarship Data:</w:t>
       </w:r>
     </w:p>
     <w:p>
@@ -10391,7 +9695,7 @@
           <w:sz w:val="22"/>
           <w:szCs w:val="22"/>
         </w:rPr>
-        <w:t xml:space="preserve">Connects students with verified volunteer counsellors and professionals. Implements strict child protection standards: students under 18 must acknowledge parental/guardian consent before booking, personal telephone numbers are shielded, and meetings occur via moderated educational channels.</w:t>
+        <w:t xml:space="preserve">Stores scholarship records with scheme title, conducting portal (MahaDBT or NSP), maximum family income limit, benefit amount, official application link, verification date, and sample record indicator.</w:t>
       </w:r>
     </w:p>
     <w:p>
@@ -10408,7 +9712,7 @@
           <w:sz w:val="20"/>
           <w:szCs w:val="20"/>
         </w:rPr>
-        <w:t xml:space="preserve">4.1.6 Interactive Student Action Roadmap &amp; Offline Tools:</w:t>
+        <w:t xml:space="preserve">4.2.3 Quiz Data:</w:t>
       </w:r>
     </w:p>
     <w:p>
@@ -10422,8 +9726,75 @@
           <w:sz w:val="22"/>
           <w:szCs w:val="22"/>
         </w:rPr>
-        <w:t xml:space="preserve">Converts career choices into step-by-step milestone checklists. Progress is persisted in browser storage and can be exported as a clean, printable PDF document designed for offline study in areas with limited internet connectivity.</w:t>
-      </w:r>
+        <w:t xml:space="preserve">Contains the 6 guided assessment questions and scoring weights used to evaluate student preferences and match them with affordable education routes.</w:t>
+      </w:r>
+    </w:p>
+    <w:p>
+      <w:pPr>
+        <w:pStyle w:val="Heading3"/>
+        <w:spacing w:after="80" w:before="180"/>
+      </w:pPr>
+      <w:r>
+        <w:rPr>
+          <w:rFonts w:ascii="Calibri" w:cs="Calibri" w:eastAsia="Calibri" w:hAnsi="Calibri"/>
+          <w:b/>
+          <w:bCs/>
+          <w:color w:val="234B38"/>
+          <w:sz w:val="20"/>
+          <w:szCs w:val="20"/>
+        </w:rPr>
+        <w:t xml:space="preserve">4.2.4 Reporting Information Data:</w:t>
+      </w:r>
+    </w:p>
+    <w:p>
+      <w:pPr>
+        <w:spacing w:after="60" w:before="60" w:line="300"/>
+      </w:pPr>
+      <w:r>
+        <w:rPr>
+          <w:rFonts w:ascii="Calibri" w:cs="Calibri" w:eastAsia="Calibri" w:hAnsi="Calibri"/>
+          <w:color w:val="303832"/>
+          <w:sz w:val="22"/>
+          <w:szCs w:val="22"/>
+        </w:rPr>
+        <w:t xml:space="preserve">Maintains mentor profile information, verified status badges, language proficiencies, and minor safeguarding confirmation records.</w:t>
+      </w:r>
+    </w:p>
+    <w:p>
+      <w:pPr>
+        <w:pStyle w:val="Heading3"/>
+        <w:spacing w:after="80" w:before="180"/>
+      </w:pPr>
+      <w:r>
+        <w:rPr>
+          <w:rFonts w:ascii="Calibri" w:cs="Calibri" w:eastAsia="Calibri" w:hAnsi="Calibri"/>
+          <w:b/>
+          <w:bCs/>
+          <w:color w:val="234B38"/>
+          <w:sz w:val="20"/>
+          <w:szCs w:val="20"/>
+        </w:rPr>
+        <w:t xml:space="preserve">4.2.5 Database Usage:</w:t>
+      </w:r>
+    </w:p>
+    <w:p>
+      <w:pPr>
+        <w:spacing w:after="60" w:before="60" w:line="300"/>
+      </w:pPr>
+      <w:r>
+        <w:rPr>
+          <w:rFonts w:ascii="Calibri" w:cs="Calibri" w:eastAsia="Calibri" w:hAnsi="Calibri"/>
+          <w:color w:val="303832"/>
+          <w:sz w:val="22"/>
+          <w:szCs w:val="22"/>
+        </w:rPr>
+        <w:t xml:space="preserve">The current implementation stores user roadmap milestones, bookmarks, and quiz progress using HTML5 LocalStorage on the client side. This ensures that students do not have to give away their private mobile numbers or create passwords, keeping the platform fast, safe, and completely private.</w:t>
+      </w:r>
+    </w:p>
+    <w:p>
+      <w:pPr>
+        <w:pageBreakBefore/>
+      </w:pPr>
     </w:p>
     <w:p>
       <w:pPr>
@@ -10439,7 +9810,7 @@
           <w:sz w:val="24"/>
           <w:szCs w:val="24"/>
         </w:rPr>
-        <w:t xml:space="preserve">4.2 Data Design &amp; State Management</w:t>
+        <w:t xml:space="preserve">4.3 Graphical User Interface (GUI) Screenshots:</w:t>
       </w:r>
     </w:p>
     <w:p>
@@ -10453,163 +9824,7 @@
           <w:sz w:val="22"/>
           <w:szCs w:val="22"/>
         </w:rPr>
-        <w:t xml:space="preserve">Udaan utilizes TypeScript strict data contracts ensuring predictability, type safety, and seamless serialization. Core data structures include:</w:t>
-      </w:r>
-    </w:p>
-    <w:p>
-      <w:pPr>
-        <w:pStyle w:val="ListParagraph"/>
-        <w:numPr>
-          <w:ilvl w:val="0"/>
-          <w:numId w:val="1"/>
-        </w:numPr>
-        <w:spacing w:after="40" w:before="40" w:line="280"/>
-      </w:pPr>
-      <w:r>
-        <w:rPr>
-          <w:rFonts w:ascii="Calibri" w:cs="Calibri" w:eastAsia="Calibri" w:hAnsi="Calibri"/>
-          <w:b/>
-          <w:bCs/>
-          <w:color w:val="234B38"/>
-          <w:sz w:val="22"/>
-          <w:szCs w:val="22"/>
-        </w:rPr>
-        <w:t xml:space="preserve">CareerItem Schema:</w:t>
-      </w:r>
-      <w:r>
-        <w:rPr>
-          <w:rFonts w:ascii="Calibri" w:cs="Calibri" w:eastAsia="Calibri" w:hAnsi="Calibri"/>
-          <w:color w:val="303832"/>
-          <w:sz w:val="22"/>
-          <w:szCs w:val="22"/>
-        </w:rPr>
-        <w:t xml:space="preserve"> { id: string, title: string, domain: string, minQualification: string, avgGovtFee: number, feeSourceDate: string, entrySalary: string, seniorSalary: string, isVocational: boolean, exams: string[], scholarships: string[] }</w:t>
-      </w:r>
-    </w:p>
-    <w:p>
-      <w:pPr>
-        <w:pStyle w:val="ListParagraph"/>
-        <w:numPr>
-          <w:ilvl w:val="0"/>
-          <w:numId w:val="1"/>
-        </w:numPr>
-        <w:spacing w:after="40" w:before="40" w:line="280"/>
-      </w:pPr>
-      <w:r>
-        <w:rPr>
-          <w:rFonts w:ascii="Calibri" w:cs="Calibri" w:eastAsia="Calibri" w:hAnsi="Calibri"/>
-          <w:b/>
-          <w:bCs/>
-          <w:color w:val="234B38"/>
-          <w:sz w:val="22"/>
-          <w:szCs w:val="22"/>
-        </w:rPr>
-        <w:t xml:space="preserve">ScholarshipScheme Schema:</w:t>
-      </w:r>
-      <w:r>
-        <w:rPr>
-          <w:rFonts w:ascii="Calibri" w:cs="Calibri" w:eastAsia="Calibri" w:hAnsi="Calibri"/>
-          <w:color w:val="303832"/>
-          <w:sz w:val="22"/>
-          <w:szCs w:val="22"/>
-        </w:rPr>
-        <w:t xml:space="preserve"> { id: string, title: string, portal: "MahaDBT" | "NSP" | "Private", incomeCeiling: number, category: string[], maxBenefit: string, officialUrl: string, isSample: boolean, lastVerifiedDate: string }</w:t>
-      </w:r>
-    </w:p>
-    <w:p>
-      <w:pPr>
-        <w:pStyle w:val="ListParagraph"/>
-        <w:numPr>
-          <w:ilvl w:val="0"/>
-          <w:numId w:val="1"/>
-        </w:numPr>
-        <w:spacing w:after="40" w:before="40" w:line="280"/>
-      </w:pPr>
-      <w:r>
-        <w:rPr>
-          <w:rFonts w:ascii="Calibri" w:cs="Calibri" w:eastAsia="Calibri" w:hAnsi="Calibri"/>
-          <w:b/>
-          <w:bCs/>
-          <w:color w:val="234B38"/>
-          <w:sz w:val="22"/>
-          <w:szCs w:val="22"/>
-        </w:rPr>
-        <w:t xml:space="preserve">RoadmapMilestone Schema:</w:t>
-      </w:r>
-      <w:r>
-        <w:rPr>
-          <w:rFonts w:ascii="Calibri" w:cs="Calibri" w:eastAsia="Calibri" w:hAnsi="Calibri"/>
-          <w:color w:val="303832"/>
-          <w:sz w:val="22"/>
-          <w:szCs w:val="22"/>
-        </w:rPr>
-        <w:t xml:space="preserve"> { stepId: number, careerId: string, title: string, description: string, isCompleted: boolean, targetDeadline: string, requiredDocuments: string[] }</w:t>
-      </w:r>
-    </w:p>
-    <w:p>
-      <w:pPr>
-        <w:pStyle w:val="ListParagraph"/>
-        <w:numPr>
-          <w:ilvl w:val="0"/>
-          <w:numId w:val="1"/>
-        </w:numPr>
-        <w:spacing w:after="40" w:before="40" w:line="280"/>
-      </w:pPr>
-      <w:r>
-        <w:rPr>
-          <w:rFonts w:ascii="Calibri" w:cs="Calibri" w:eastAsia="Calibri" w:hAnsi="Calibri"/>
-          <w:b/>
-          <w:bCs/>
-          <w:color w:val="234B38"/>
-          <w:sz w:val="22"/>
-          <w:szCs w:val="22"/>
-        </w:rPr>
-        <w:t xml:space="preserve">Client Storage Architecture:</w:t>
-      </w:r>
-      <w:r>
-        <w:rPr>
-          <w:rFonts w:ascii="Calibri" w:cs="Calibri" w:eastAsia="Calibri" w:hAnsi="Calibri"/>
-          <w:color w:val="303832"/>
-          <w:sz w:val="22"/>
-          <w:szCs w:val="22"/>
-        </w:rPr>
-        <w:t xml:space="preserve"> Uses HTML5 LocalStorage with scoped keys ("udaan_bookmarks", "udaan_roadmap", "udaan_quiz_state"). Zero server-side session tracking guarantees student privacy.</w:t>
-      </w:r>
-    </w:p>
-    <w:p>
-      <w:pPr>
-        <w:pageBreakBefore/>
-      </w:pPr>
-    </w:p>
-    <w:p>
-      <w:pPr>
-        <w:pStyle w:val="Heading2"/>
-        <w:spacing w:after="100" w:before="240"/>
-      </w:pPr>
-      <w:r>
-        <w:rPr>
-          <w:rFonts w:ascii="Calibri" w:cs="Calibri" w:eastAsia="Calibri" w:hAnsi="Calibri"/>
-          <w:b/>
-          <w:bCs/>
-          <w:color w:val="C66B4E"/>
-          <w:sz w:val="24"/>
-          <w:szCs w:val="24"/>
-        </w:rPr>
-        <w:t xml:space="preserve">4.3 Graphical User Interface (GUI) Screenshots</w:t>
-      </w:r>
-    </w:p>
-    <w:p>
-      <w:pPr>
-        <w:spacing w:after="60" w:before="60" w:line="300"/>
-      </w:pPr>
-      <w:r>
-        <w:rPr>
-          <w:rFonts w:ascii="Calibri" w:cs="Calibri" w:eastAsia="Calibri" w:hAnsi="Calibri"/>
-          <w:color w:val="303832"/>
-          <w:sz w:val="22"/>
-          <w:szCs w:val="22"/>
-        </w:rPr>
-        <w:t xml:space="preserve">The following screenshots demonstrate the actual rendered interfaces of the Udaan platform, designed using an art-directed color palette: Forest Green (#234B38), Warm Ivory (#F8F6EF), Terracotta (#C66B4E), and Charcoal (#303832).</w:t>
+        <w:t xml:space="preserve">The graphical user interface of Udaan is designed to look clean, welcoming, and easy to read. It uses warm ivory, forest green, terracotta, and charcoal colors rather than generic AI templates.</w:t>
       </w:r>
     </w:p>
     <w:p>
@@ -10672,7 +9887,7 @@
           <w:sz w:val="18"/>
           <w:szCs w:val="18"/>
         </w:rPr>
-        <w:t xml:space="preserve">Plate 4.1: Udaan Home Page featuring Multilingual Switcher, Audio Reader &amp; Educational Hierarchy</w:t>
+        <w:t xml:space="preserve">Plate 4.1: Home Page showing Language Switcher, Audio Reader, and Education Levels</w:t>
       </w:r>
     </w:p>
     <w:p>
@@ -10735,7 +9950,7 @@
           <w:sz w:val="18"/>
           <w:szCs w:val="18"/>
         </w:rPr>
-        <w:t xml:space="preserve">Plate 4.2: Career Explorer Directory with 9 Domains, Reality-Check Course Fees &amp; Salary Context</w:t>
+        <w:t xml:space="preserve">Plate 4.2: Career Explorer Page showing 9 Domains, Search, and Reality-Check Fee Details</w:t>
       </w:r>
     </w:p>
     <w:p>
@@ -10798,7 +10013,7 @@
           <w:sz w:val="18"/>
           <w:szCs w:val="18"/>
         </w:rPr>
-        <w:t xml:space="preserve">Plate 4.3: Scholarship Finder with dedicated MahaDBT filter, income ceilings and official portal links</w:t>
+        <w:t xml:space="preserve">Plate 4.3: Scholarship Page with MahaDBT filter, income limits, and official portal links</w:t>
       </w:r>
     </w:p>
     <w:p>
@@ -10861,7 +10076,7 @@
           <w:sz w:val="18"/>
           <w:szCs w:val="18"/>
         </w:rPr>
-        <w:t xml:space="preserve">Plate 4.4: 6-Step Guided Career Assessment evaluating qualification, interests, and budget limits</w:t>
+        <w:t xml:space="preserve">Plate 4.4: Guided Career Assessment Quiz evaluating class, interests, and budget</w:t>
       </w:r>
     </w:p>
     <w:p>
@@ -10924,7 +10139,7 @@
           <w:sz w:val="18"/>
           <w:szCs w:val="18"/>
         </w:rPr>
-        <w:t xml:space="preserve">Plate 4.5: Mentorship Directory with Verified Volunteers and Mandatory Minor Safeguarding Modal</w:t>
+        <w:t xml:space="preserve">Plate 4.5: Mentor Directory Page with Verified Volunteers and Minor Safeguarding Consent Modal</w:t>
       </w:r>
     </w:p>
     <w:p>
@@ -10987,7 +10202,7 @@
           <w:sz w:val="18"/>
           <w:szCs w:val="18"/>
         </w:rPr>
-        <w:t xml:space="preserve">Plate 4.6: Student Action Roadmap with interactive milestone progress and offline PDF print tool</w:t>
+        <w:t xml:space="preserve">Plate 4.6: Student Roadmap Page with progress checklist and printable offline study plan</w:t>
       </w:r>
     </w:p>
     <w:p>
@@ -11009,7 +10224,7 @@
           <w:sz w:val="28"/>
           <w:szCs w:val="28"/>
         </w:rPr>
-        <w:t xml:space="preserve">5. CONCLUSION AND RECOMMENDATIONS</w:t>
+        <w:t xml:space="preserve">5. Conclusion &amp; Recommendation</w:t>
       </w:r>
     </w:p>
     <w:p>
@@ -11026,7 +10241,7 @@
           <w:sz w:val="24"/>
           <w:szCs w:val="24"/>
         </w:rPr>
-        <w:t xml:space="preserve">5.1 Conclusion</w:t>
+        <w:t xml:space="preserve">5.1 Conclusion:</w:t>
       </w:r>
     </w:p>
     <w:p>
@@ -11040,7 +10255,7 @@
           <w:sz w:val="22"/>
           <w:szCs w:val="22"/>
         </w:rPr>
-        <w:t xml:space="preserve">The Udaan Career Guidance Portal successfully demonstrates how thoughtful software engineering, human-centered product design, and localized content can address deep systemic inequalities in the Indian education ecosystem. By demystifying entrance examinations, detailing low-cost government college options, providing direct access to state welfare schemes on MahaDBT and central NSP, and offering an automated affordability assessment, Udaan equips underprivileged students with the agency and information needed to shape their own futures.</w:t>
+        <w:t xml:space="preserve">Udaan – Online Career Guidance Portal for Underprivileged Students was developed to bridge the guidance gap for students from government schools, rural areas, and low-income families in Mumbai and across India. By providing clear educational pathways, transparent government college fees, direct links to official scholarships on MahaDBT and the National Scholarship Portal, and a budget-aware career quiz, the project helps first-generation college students make informed career decisions without falling into debt.</w:t>
       </w:r>
     </w:p>
     <w:p>
@@ -11054,7 +10269,7 @@
           <w:sz w:val="22"/>
           <w:szCs w:val="22"/>
         </w:rPr>
-        <w:t xml:space="preserve">The application was rigorously audited and field-tested in Chembur and Govandi, confirming zero console errors, full keyboard accessibility, responsive mobile performance on budget smartphones, and high user acceptance among first-generation college aspirants. The integration of minor-safeguarding protocols sets a high standard for youth protection in digital educational tools.</w:t>
+        <w:t xml:space="preserve">During our community field testing in Chembur and Govandi, we verified that the website works smoothly on basic Android smartphones, uses minimal internet data, and is easy to understand in Marathi and Hindi. Features like audio narration and printable PDF roadmaps proved very helpful for students and parents with limited digital literacy.</w:t>
       </w:r>
     </w:p>
     <w:p>
@@ -11117,7 +10332,7 @@
           <w:sz w:val="18"/>
           <w:szCs w:val="18"/>
         </w:rPr>
-        <w:t xml:space="preserve">Plate 5.1: Community Demonstration — Demonstrating Udaan portal to youth near Govandi Flyover, Mumbai (GPS Lat: 19.062197°, Long: 72.917093°)</w:t>
+        <w:t xml:space="preserve">Plate 5.1: Demonstrating Udaan portal to local students near Govandi Flyover, Mumbai (GPS Lat: 19.062197°, Long: 72.917093°)</w:t>
       </w:r>
     </w:p>
     <w:p>
@@ -11134,7 +10349,7 @@
           <w:sz w:val="24"/>
           <w:szCs w:val="24"/>
         </w:rPr>
-        <w:t xml:space="preserve">5.2 Recommendations and Future Enhancements</w:t>
+        <w:t xml:space="preserve">5.2 Recommendations and Future Enhancements:</w:t>
       </w:r>
     </w:p>
     <w:p>
@@ -11148,7 +10363,7 @@
           <w:sz w:val="22"/>
           <w:szCs w:val="22"/>
         </w:rPr>
-        <w:t xml:space="preserve">While the current version of Udaan provides a complete and robust client-side platform, the following future enhancements are recommended for subsequent phases:</w:t>
+        <w:t xml:space="preserve">The application can be developed further in the future by adding features such as:</w:t>
       </w:r>
     </w:p>
     <w:p>
@@ -11169,16 +10384,16 @@
           <w:sz w:val="22"/>
           <w:szCs w:val="22"/>
         </w:rPr>
-        <w:t xml:space="preserve">AI Vernacular Voice Assistant:</w:t>
-      </w:r>
-      <w:r>
-        <w:rPr>
-          <w:rFonts w:ascii="Calibri" w:cs="Calibri" w:eastAsia="Calibri" w:hAnsi="Calibri"/>
-          <w:color w:val="303832"/>
-          <w:sz w:val="22"/>
-          <w:szCs w:val="22"/>
-        </w:rPr>
-        <w:t xml:space="preserve"> Integrate conversational speech recognition in Marathi, Hindi, and regional dialects to allow illiterate parents to ask spoken career and scholarship questions.</w:t>
+        <w:t xml:space="preserve">1. Voice-Based Assistant in Marathi and Hindi:</w:t>
+      </w:r>
+      <w:r>
+        <w:rPr>
+          <w:rFonts w:ascii="Calibri" w:cs="Calibri" w:eastAsia="Calibri" w:hAnsi="Calibri"/>
+          <w:color w:val="303832"/>
+          <w:sz w:val="22"/>
+          <w:szCs w:val="22"/>
+        </w:rPr>
+        <w:t xml:space="preserve"> Adding speech-to-text input so students and parents can speak questions in their own language.</w:t>
       </w:r>
     </w:p>
     <w:p>
@@ -11199,16 +10414,16 @@
           <w:sz w:val="22"/>
           <w:szCs w:val="22"/>
         </w:rPr>
-        <w:t xml:space="preserve">WhatsApp Bot Integration:</w:t>
-      </w:r>
-      <w:r>
-        <w:rPr>
-          <w:rFonts w:ascii="Calibri" w:cs="Calibri" w:eastAsia="Calibri" w:hAnsi="Calibri"/>
-          <w:color w:val="303832"/>
-          <w:sz w:val="22"/>
-          <w:szCs w:val="22"/>
-        </w:rPr>
-        <w:t xml:space="preserve"> Because WhatsApp is universally accessible even on low-end devices, deploying a lightweight Udaan WhatsApp chatbot can deliver automated MahaDBT deadline alerts directly to students.</w:t>
+        <w:t xml:space="preserve">2. WhatsApp Notification Alerts:</w:t>
+      </w:r>
+      <w:r>
+        <w:rPr>
+          <w:rFonts w:ascii="Calibri" w:cs="Calibri" w:eastAsia="Calibri" w:hAnsi="Calibri"/>
+          <w:color w:val="303832"/>
+          <w:sz w:val="22"/>
+          <w:szCs w:val="22"/>
+        </w:rPr>
+        <w:t xml:space="preserve"> Sending free WhatsApp alerts about upcoming MahaDBT scholarship deadlines and entrance exam application dates.</w:t>
       </w:r>
     </w:p>
     <w:p>
@@ -11229,16 +10444,16 @@
           <w:sz w:val="22"/>
           <w:szCs w:val="22"/>
         </w:rPr>
-        <w:t xml:space="preserve">Automated Document OCR Readiness Checker:</w:t>
-      </w:r>
-      <w:r>
-        <w:rPr>
-          <w:rFonts w:ascii="Calibri" w:cs="Calibri" w:eastAsia="Calibri" w:hAnsi="Calibri"/>
-          <w:color w:val="303832"/>
-          <w:sz w:val="22"/>
-          <w:szCs w:val="22"/>
-        </w:rPr>
-        <w:t xml:space="preserve"> Incorporate client-side document scanning using lightweight optical character recognition to verify that a student’s income and caste certificates meet MahaDBT validity criteria before applying.</w:t>
+        <w:t xml:space="preserve">3. Certificate Scanner:</w:t>
+      </w:r>
+      <w:r>
+        <w:rPr>
+          <w:rFonts w:ascii="Calibri" w:cs="Calibri" w:eastAsia="Calibri" w:hAnsi="Calibri"/>
+          <w:color w:val="303832"/>
+          <w:sz w:val="22"/>
+          <w:szCs w:val="22"/>
+        </w:rPr>
+        <w:t xml:space="preserve"> Allowing students to take a photo of their income or caste certificate on their phone to check if it matches scholarship eligibility rules.</w:t>
       </w:r>
     </w:p>
     <w:p>
@@ -11259,16 +10474,16 @@
           <w:sz w:val="22"/>
           <w:szCs w:val="22"/>
         </w:rPr>
-        <w:t xml:space="preserve">State Portal API Partnerships:</w:t>
-      </w:r>
-      <w:r>
-        <w:rPr>
-          <w:rFonts w:ascii="Calibri" w:cs="Calibri" w:eastAsia="Calibri" w:hAnsi="Calibri"/>
-          <w:color w:val="303832"/>
-          <w:sz w:val="22"/>
-          <w:szCs w:val="22"/>
-        </w:rPr>
-        <w:t xml:space="preserve"> Collaborate with the Maharashtra State Innovation Society and Department of Higher and Technical Education to enable direct single-sign-on (SSO) with MahaDBT.</w:t>
+        <w:t xml:space="preserve">4. Additional Indian Languages:</w:t>
+      </w:r>
+      <w:r>
+        <w:rPr>
+          <w:rFonts w:ascii="Calibri" w:cs="Calibri" w:eastAsia="Calibri" w:hAnsi="Calibri"/>
+          <w:color w:val="303832"/>
+          <w:sz w:val="22"/>
+          <w:szCs w:val="22"/>
+        </w:rPr>
+        <w:t xml:space="preserve"> Expanding the portal to include Gujarati, Urdu, Tamil, and Bengali to help students in other parts of the country.</w:t>
       </w:r>
     </w:p>
     <w:p>
@@ -11290,7 +10505,7 @@
           <w:sz w:val="28"/>
           <w:szCs w:val="28"/>
         </w:rPr>
-        <w:t xml:space="preserve">6. REFERENCES &amp; BIBLIOGRAPHY</w:t>
+        <w:t xml:space="preserve">6. References:</w:t>
       </w:r>
     </w:p>
     <w:p>
@@ -11304,7 +10519,7 @@
           <w:sz w:val="22"/>
           <w:szCs w:val="22"/>
         </w:rPr>
-        <w:t xml:space="preserve">The following official portals, government publications, and academic resources were consulted during the planning, field research, and implementation of the Udaan portal:</w:t>
+        <w:t xml:space="preserve">The following resources, official government websites, and technical documentation were used during the development of the Udaan project:</w:t>
       </w:r>
     </w:p>
     <w:p>
@@ -11424,7 +10639,7 @@
           <w:sz w:val="22"/>
           <w:szCs w:val="22"/>
         </w:rPr>
-        <w:t xml:space="preserve"> Ministry of Skill Development and Entrepreneurship, Government of India. Craftsmen Training Scheme (CTS) ITI Portal. Available at: https://www.dgt.gov.in/</w:t>
+        <w:t xml:space="preserve"> Directorate General of Training (DGT), Ministry of Skill Development and Entrepreneurship. Craftsmen Training Scheme (CTS) ITI Portal. Available at: https://www.dgt.gov.in/</w:t>
       </w:r>
     </w:p>
     <w:p>
@@ -11454,7 +10669,7 @@
           <w:sz w:val="22"/>
           <w:szCs w:val="22"/>
         </w:rPr>
-        <w:t xml:space="preserve"> National Council of Educational Research and Training (NCERT). Career Guidance and Counselling Guidelines for Secondary Schools, New Delhi, 2024.</w:t>
+        <w:t xml:space="preserve"> National Council of Educational Research and Training (NCERT). Career Guidance Guidelines for Secondary School Students, New Delhi.</w:t>
       </w:r>
     </w:p>
     <w:p>
@@ -11484,7 +10699,7 @@
           <w:sz w:val="22"/>
           <w:szCs w:val="22"/>
         </w:rPr>
-        <w:t xml:space="preserve"> National Education Policy (NEP) 2020. Ministry of Human Resource Development, Government of India.</w:t>
+        <w:t xml:space="preserve"> Ministry of Education, Government of India. National Education Policy (NEP) 2020.</w:t>
       </w:r>
     </w:p>
     <w:p>
@@ -11514,7 +10729,7 @@
           <w:sz w:val="22"/>
           <w:szCs w:val="22"/>
         </w:rPr>
-        <w:t xml:space="preserve"> React Documentation and Architecture Standards. Available at: https://react.dev/</w:t>
+        <w:t xml:space="preserve"> React Documentation and Community Guidelines. Available at: https://react.dev/</w:t>
       </w:r>
     </w:p>
     <w:p>
@@ -11544,7 +10759,7 @@
           <w:sz w:val="22"/>
           <w:szCs w:val="22"/>
         </w:rPr>
-        <w:t xml:space="preserve"> TypeScript Handbook and Type Safety Specifications. Microsoft Corporation. Available at: https://www.typescriptlang.org/</w:t>
+        <w:t xml:space="preserve"> TypeScript Official Handbook. Microsoft Corporation. Available at: https://www.typescriptlang.org/</w:t>
       </w:r>
     </w:p>
     <w:p>
@@ -11574,7 +10789,7 @@
           <w:sz w:val="22"/>
           <w:szCs w:val="22"/>
         </w:rPr>
-        <w:t xml:space="preserve"> Vite Next-Generation Frontend Tooling. Available at: https://vite.dev/</w:t>
+        <w:t xml:space="preserve"> Vite Frontend Tooling Documentation. Available at: https://vite.dev/</w:t>
       </w:r>
     </w:p>
     <w:p>
@@ -11604,7 +10819,7 @@
           <w:sz w:val="22"/>
           <w:szCs w:val="22"/>
         </w:rPr>
-        <w:t xml:space="preserve"> World Wide Web Consortium (W3C). Web Content Accessibility Guidelines (WCAG) 2.1 Level AA Standards. Available at: https://www.w3.org/WAI/standards-guidelines/wcag/</w:t>
+        <w:t xml:space="preserve"> World Wide Web Consortium (W3C). Web Content Accessibility Guidelines (WCAG) 2.1 Standards. Available at: https://www.w3.org/WAI/</w:t>
       </w:r>
     </w:p>
     <w:p>
@@ -11634,7 +10849,7 @@
           <w:sz w:val="22"/>
           <w:szCs w:val="22"/>
         </w:rPr>
-        <w:t xml:space="preserve"> University Grants Commission (UGC), New Delhi. Fee Concession &amp; Anti-Capitation Policies for Higher Education Institutions. Available at: https://www.ugc.gov.in/</w:t>
+        <w:t xml:space="preserve"> Mozilla Developer Network (MDN). Web Storage API and Web Speech API. Available at: https://developer.mozilla.org/</w:t>
       </w:r>
     </w:p>
     <w:p>
@@ -11656,7 +10871,7 @@
           <w:sz w:val="20"/>
           <w:szCs w:val="20"/>
         </w:rPr>
-        <w:t xml:space="preserve">*** END OF PROJECT VIVA DOCUMENTATION ***</w:t>
+        <w:t xml:space="preserve">*** END OF PROJECT REPORT ***</w:t>
       </w:r>
     </w:p>
     <w:sectPr>

</xml_diff>